<commit_message>
feat: consolidate universal fundamental analysis orchestrator, certified standard corporate archetype, and web dashboard
</commit_message>
<xml_diff>
--- a/data/processed/MELI/Analisis_Resultados_Q2_2026_MELI.docx
+++ b/data/processed/MELI/Analisis_Resultados_Q2_2026_MELI.docx
@@ -65,7 +65,7 @@
                 <w:color w:val="D1DFF5"/>
                 <w:sz w:val="17"/>
               </w:rPr>
-              <w:t>Fecha de Análisis: 22 de Septiembre de 2026 | Período Contable: 30 de Junio de 2026</w:t>
+              <w:t>Fecha de Análisis: 13 de Septiembre de 2026 | Período Contable: 30 de Junio de 2026</w:t>
               <w:br/>
               <w:t>Fuente Oficial: Formulario 10-Q, Formularios 8-K, Form 4, Form 144 (SEC EDGAR) &amp; Q2 2026 Earnings Call Transcript</w:t>
             </w:r>
@@ -594,7 +594,7 @@
                 <w:color w:val="2D3748"/>
                 <w:sz w:val="18"/>
               </w:rPr>
-              <w:t>50.0% Consolidado</w:t>
+              <w:t>55.0% Mix</w:t>
             </w:r>
           </w:p>
         </w:tc>
@@ -620,7 +620,7 @@
                 <w:color w:val="2D3748"/>
                 <w:sz w:val="18"/>
               </w:rPr>
-              <w:t>Crecimiento estructural y tracción en canales clave.</w:t>
+              <w:t>Aceleración comercial de alta tracción (+21.8% YoY); ganancia de cuota y dinamismo.</w:t>
             </w:r>
           </w:p>
         </w:tc>
@@ -752,7 +752,7 @@
                 <w:color w:val="2D3748"/>
                 <w:sz w:val="18"/>
               </w:rPr>
-              <w:t>50.0% Consolidado</w:t>
+              <w:t>45.0% Mix</w:t>
             </w:r>
           </w:p>
         </w:tc>
@@ -778,7 +778,7 @@
                 <w:color w:val="2D3748"/>
                 <w:sz w:val="18"/>
               </w:rPr>
-              <w:t>Récord en Cloud y Pagos; recurrencia de alto margen (&gt;70%).</w:t>
+              <w:t>Aceleración comercial de alta tracción (+21.8% YoY); ganancia de cuota y dinamismo.</w:t>
             </w:r>
           </w:p>
         </w:tc>
@@ -1219,7 +1219,7 @@
                 <w:color w:val="2D3748"/>
                 <w:sz w:val="18"/>
               </w:rPr>
-              <w:t>Mercado estratégico clave; sólida demanda y disciplina de precios.</w:t>
+              <w:t>Mercado en fuerte expansión (+21.8% YoY); tracción de demanda local.</w:t>
             </w:r>
           </w:p>
         </w:tc>
@@ -1377,7 +1377,7 @@
                 <w:color w:val="2D3748"/>
                 <w:sz w:val="18"/>
               </w:rPr>
-              <w:t>Mercado estratégico clave; sólida demanda y disciplina de precios.</w:t>
+              <w:t>Mercado en fuerte expansión (+21.8% YoY); tracción de demanda local.</w:t>
             </w:r>
           </w:p>
         </w:tc>
@@ -1535,7 +1535,7 @@
                 <w:color w:val="2D3748"/>
                 <w:sz w:val="18"/>
               </w:rPr>
-              <w:t>Mercado estratégico clave; sólida demanda y disciplina de precios.</w:t>
+              <w:t>Mercado en fuerte expansión (+21.8% YoY); tracción de demanda local.</w:t>
             </w:r>
           </w:p>
         </w:tc>
@@ -1693,7 +1693,7 @@
                 <w:color w:val="2D3748"/>
                 <w:sz w:val="18"/>
               </w:rPr>
-              <w:t>Mercado estratégico clave; sólida demanda y disciplina de precios.</w:t>
+              <w:t>Mercado en fuerte expansión (+21.8% YoY); tracción de demanda local.</w:t>
             </w:r>
           </w:p>
         </w:tc>
@@ -10982,7 +10982,7 @@
                 <w:color w:val="2D3748"/>
                 <w:sz w:val="19"/>
               </w:rPr>
-              <w:t>Mohanram G-Score (Ventaja Sectorial):  4 / 8 Puntos | CRECIMIENTO PROMEDIO</w:t>
+              <w:t>Mohanram G-Score (Ventaja Sectorial):  3 / 8 Puntos | CRECIMIENTO FRÁGIL</w:t>
             </w:r>
           </w:p>
           <w:p>
@@ -11101,7 +11101,7 @@
           <w:color w:val="2D3748"/>
           <w:sz w:val="20"/>
         </w:rPr>
-        <w:t>La caja operativa ($13.9B en LTM) respalda con holgura al beneficio neto contable ($1,863.0M), descartando manipulación de inventarios o ventas a crédito ficticias.</w:t>
+        <w:t>La caja operativa ($13,905.0M en LTM) respalda con holgura al beneficio neto contable ($1,863.0M), descartando manipulación de inventarios o ventas a crédito ficticias.</w:t>
       </w:r>
     </w:p>
     <w:p>
@@ -11485,7 +11485,7 @@
                 <w:color w:val="2D3748"/>
                 <w:sz w:val="18"/>
               </w:rPr>
-              <w:t>$13.9B &gt; $0</w:t>
+              <w:t>$13,905.0M &gt; $0</w:t>
             </w:r>
           </w:p>
         </w:tc>
@@ -11697,7 +11697,7 @@
                 <w:color w:val="2D3748"/>
                 <w:sz w:val="18"/>
               </w:rPr>
-              <w:t>CFO $13.9B &gt; NI $1.9B</w:t>
+              <w:t>CFO $13,905.0M &gt; NI $1,863.0M</w:t>
             </w:r>
           </w:p>
         </w:tc>
@@ -12313,7 +12313,7 @@
           <w:color w:val="2D3748"/>
           <w:sz w:val="20"/>
         </w:rPr>
-        <w:t>4 / 8 Puntos en LTM (CRECIMIENTO PROMEDIO) (5 / 8 en FY2025).</w:t>
+        <w:t>3 / 8 Puntos en LTM (CRECIMIENTO FRÁGIL) (5 / 8 en FY2025).</w:t>
       </w:r>
     </w:p>
     <w:p>
@@ -12336,7 +12336,7 @@
           <w:color w:val="2D3748"/>
           <w:sz w:val="20"/>
         </w:rPr>
-        <w:t>Una puntuación de 4/8 consolida a MercadoLibre, Inc. como líder de calidad fundamental en su industria. Certifica que la firma:</w:t>
+        <w:t>Una puntuación de 3/8 consolida a MercadoLibre, Inc. como líder de calidad fundamental en su industria. Certifica que la firma:</w:t>
       </w:r>
     </w:p>
     <w:p>
@@ -12826,7 +12826,7 @@
                 <w:color w:val="2D3748"/>
                 <w:sz w:val="18"/>
               </w:rPr>
-              <w:t>CFO $13.9B &gt; NI $1.9B</w:t>
+              <w:t>CFO $13,905.0M &gt; NI $1,863.0M</w:t>
             </w:r>
           </w:p>
         </w:tc>
@@ -13038,7 +13038,7 @@
                 <w:color w:val="2D3748"/>
                 <w:sz w:val="18"/>
               </w:rPr>
-              <w:t>CV 0.12 vs 0.40</w:t>
+              <w:t>CV 0.16 vs 0.40</w:t>
             </w:r>
           </w:p>
         </w:tc>
@@ -13144,7 +13144,7 @@
                 <w:color w:val="2D3748"/>
                 <w:sz w:val="18"/>
               </w:rPr>
-              <w:t>I+D 4.59% vs Med 9.77%</w:t>
+              <w:t>I+D 6.04% vs Med 9.77%</w:t>
             </w:r>
           </w:p>
         </w:tc>
@@ -13356,7 +13356,7 @@
                 <w:color w:val="2D3748"/>
                 <w:sz w:val="18"/>
               </w:rPr>
-              <w:t>Vtas +21.8% vs SG&amp;A -25.4%</w:t>
+              <w:t>Vtas +21.8% vs SG&amp;A +25.4%</w:t>
             </w:r>
           </w:p>
         </w:tc>
@@ -13382,7 +13382,7 @@
                 <w:color w:val="2D3748"/>
                 <w:sz w:val="18"/>
               </w:rPr>
-              <w:t>1 Pto</w:t>
+              <w:t>0 Ptos</w:t>
             </w:r>
           </w:p>
         </w:tc>
@@ -13768,7 +13768,7 @@
                 <w:color w:val="2D3748"/>
                 <w:sz w:val="18"/>
               </w:rPr>
-              <w:t>$5,000 M</w:t>
+              <w:t>N/D</w:t>
             </w:r>
           </w:p>
         </w:tc>
@@ -13794,7 +13794,7 @@
                 <w:color w:val="2D3748"/>
                 <w:sz w:val="18"/>
               </w:rPr>
-              <w:t>50.0%</w:t>
+              <w:t>N/D</w:t>
             </w:r>
           </w:p>
         </w:tc>
@@ -13820,7 +13820,7 @@
                 <w:color w:val="2D3748"/>
                 <w:sz w:val="18"/>
               </w:rPr>
-              <w:t>20.0%</w:t>
+              <w:t>N/D</w:t>
             </w:r>
           </w:p>
         </w:tc>
@@ -13846,7 +13846,7 @@
                 <w:color w:val="2D3748"/>
                 <w:sz w:val="18"/>
               </w:rPr>
-              <w:t>30.0%</w:t>
+              <w:t>N/D</w:t>
             </w:r>
           </w:p>
         </w:tc>
@@ -13872,7 +13872,7 @@
                 <w:color w:val="2D3748"/>
                 <w:sz w:val="18"/>
               </w:rPr>
-              <w:t>50.0%</w:t>
+              <w:t>N/D</w:t>
             </w:r>
           </w:p>
         </w:tc>
@@ -13924,7 +13924,7 @@
                 <w:color w:val="2D3748"/>
                 <w:sz w:val="18"/>
               </w:rPr>
-              <w:t>4 / 8</w:t>
+              <w:t>3 / 8</w:t>
             </w:r>
           </w:p>
         </w:tc>
@@ -14004,7 +14004,7 @@
                 <w:color w:val="2D3748"/>
                 <w:sz w:val="18"/>
               </w:rPr>
-              <w:t>$5,000 M</w:t>
+              <w:t>N/D</w:t>
             </w:r>
           </w:p>
         </w:tc>
@@ -14030,7 +14030,7 @@
                 <w:color w:val="2D3748"/>
                 <w:sz w:val="18"/>
               </w:rPr>
-              <w:t>40.0%</w:t>
+              <w:t>N/D</w:t>
             </w:r>
           </w:p>
         </w:tc>
@@ -14056,7 +14056,7 @@
                 <w:color w:val="2D3748"/>
                 <w:sz w:val="18"/>
               </w:rPr>
-              <w:t>10.0%</w:t>
+              <w:t>N/D</w:t>
             </w:r>
           </w:p>
         </w:tc>
@@ -14082,7 +14082,7 @@
                 <w:color w:val="2D3748"/>
                 <w:sz w:val="18"/>
               </w:rPr>
-              <w:t>15.0%</w:t>
+              <w:t>N/D</w:t>
             </w:r>
           </w:p>
         </w:tc>
@@ -14108,7 +14108,7 @@
                 <w:color w:val="2D3748"/>
                 <w:sz w:val="18"/>
               </w:rPr>
-              <w:t>30.0%</w:t>
+              <w:t>N/D</w:t>
             </w:r>
           </w:p>
         </w:tc>
@@ -14134,7 +14134,7 @@
                 <w:color w:val="2D3748"/>
                 <w:sz w:val="18"/>
               </w:rPr>
-              <w:t>6 / 9</w:t>
+              <w:t>N/D</w:t>
             </w:r>
           </w:p>
         </w:tc>
@@ -14160,7 +14160,7 @@
                 <w:color w:val="2D3748"/>
                 <w:sz w:val="18"/>
               </w:rPr>
-              <w:t>4 / 8</w:t>
+              <w:t>N/D</w:t>
             </w:r>
           </w:p>
         </w:tc>
@@ -15338,7 +15338,7 @@
                 <w:color w:val="2D3748"/>
                 <w:sz w:val="19"/>
               </w:rPr>
-              <w:t>Alerta de eficiencia: tanto el margen bruto (42.7% si existe) como la rotación (0.69x) se sitúan por debajo de las medianas de la industria. El capital instalado no genera suficiente valor económico por unidad de costo.</w:t>
+              <w:t>Alerta de eficiencia: tanto el margen bruto (42.7%) como la rotación (0.69x) se sitúan por debajo de las medianas de la industria. El capital instalado no genera suficiente valor económico por unidad de costo.</w:t>
             </w:r>
           </w:p>
           <w:p>
@@ -16305,7 +16305,7 @@
                 <w:color w:val="2D3748"/>
                 <w:sz w:val="19"/>
               </w:rPr>
-              <w:t>• Expansión a 3 Años (vs. FY2023): -11.60 puntos porcentuales.</w:t>
+              <w:t>• Expansión a 3 Años (vs. FY2023): -13.86 puntos porcentuales.</w:t>
             </w:r>
           </w:p>
           <w:p>
@@ -16331,7 +16331,7 @@
                 <w:color w:val="2D3748"/>
                 <w:sz w:val="19"/>
               </w:rPr>
-              <w:t>• Coeficiente de Variación (CV GP/A): 0.142 (indica una trayectoria predecible y baja volatilidad operativa).</w:t>
+              <w:t>• Coeficiente de Variación (CV GP/A): 0.160 (indica una trayectoria predecible y baja volatilidad operativa).</w:t>
             </w:r>
           </w:p>
           <w:p>
@@ -17194,7 +17194,7 @@
                 <w:color w:val="2D3748"/>
                 <w:sz w:val="17"/>
               </w:rPr>
-              <w:t>40.84%</w:t>
+              <w:t>43.10%</w:t>
             </w:r>
           </w:p>
         </w:tc>
@@ -17221,7 +17221,7 @@
                 <w:color w:val="2D3748"/>
                 <w:sz w:val="17"/>
               </w:rPr>
-              <w:t>47.75%</w:t>
+              <w:t>50.41%</w:t>
             </w:r>
           </w:p>
         </w:tc>
@@ -17248,7 +17248,7 @@
                 <w:color w:val="2D3748"/>
                 <w:sz w:val="17"/>
               </w:rPr>
-              <w:t>+6.92 pp</w:t>
+              <w:t>+7.32 pp</w:t>
             </w:r>
           </w:p>
         </w:tc>
@@ -17275,7 +17275,7 @@
                 <w:color w:val="2D3748"/>
                 <w:sz w:val="17"/>
               </w:rPr>
-              <w:t>49.79%</w:t>
+              <w:t>50.24%</w:t>
             </w:r>
           </w:p>
         </w:tc>
@@ -17302,7 +17302,7 @@
                 <w:color w:val="2D3748"/>
                 <w:sz w:val="17"/>
               </w:rPr>
-              <w:t>0.820x</w:t>
+              <w:t>0.858x</w:t>
             </w:r>
           </w:p>
         </w:tc>
@@ -17385,7 +17385,7 @@
                 <w:color w:val="2D3748"/>
                 <w:sz w:val="17"/>
               </w:rPr>
-              <w:t>37.59%</w:t>
+              <w:t>37.84%</w:t>
             </w:r>
           </w:p>
         </w:tc>
@@ -17412,7 +17412,7 @@
                 <w:color w:val="2D3748"/>
                 <w:sz w:val="17"/>
               </w:rPr>
-              <w:t>43.66%</w:t>
+              <w:t>43.95%</w:t>
             </w:r>
           </w:p>
         </w:tc>
@@ -17439,7 +17439,7 @@
                 <w:color w:val="2D3748"/>
                 <w:sz w:val="17"/>
               </w:rPr>
-              <w:t>+6.07 pp</w:t>
+              <w:t>+6.11 pp</w:t>
             </w:r>
           </w:p>
         </w:tc>
@@ -17466,7 +17466,7 @@
                 <w:color w:val="2D3748"/>
                 <w:sz w:val="17"/>
               </w:rPr>
-              <w:t>49.00%</w:t>
+              <w:t>48.22%</w:t>
             </w:r>
           </w:p>
         </w:tc>
@@ -17493,7 +17493,7 @@
                 <w:color w:val="2D3748"/>
                 <w:sz w:val="17"/>
               </w:rPr>
-              <w:t>0.767x</w:t>
+              <w:t>0.785x</w:t>
             </w:r>
           </w:p>
         </w:tc>
@@ -17848,7 +17848,7 @@
                 <w:color w:val="2D3748"/>
                 <w:sz w:val="17"/>
               </w:rPr>
-              <w:t>43.02%</w:t>
+              <w:t>43.00%</w:t>
             </w:r>
           </w:p>
         </w:tc>
@@ -18424,8 +18424,8 @@
             <w:r>
               <w:rPr>
                 <w:rFonts w:ascii="Calibri" w:hAnsi="Calibri"/>
-                <w:b/>
-                <w:color w:val="1B365D"/>
+                <w:b w:val="0"/>
+                <w:color w:val="2D3748"/>
                 <w:sz w:val="17"/>
               </w:rPr>
               <w:t>#1</w:t>
@@ -18451,11 +18451,11 @@
             <w:r>
               <w:rPr>
                 <w:rFonts w:ascii="Calibri" w:hAnsi="Calibri"/>
-                <w:b/>
-                <w:color w:val="1B365D"/>
-                <w:sz w:val="17"/>
-              </w:rPr>
-              <w:t>MELI</w:t>
+                <w:b w:val="0"/>
+                <w:color w:val="2D3748"/>
+                <w:sz w:val="17"/>
+              </w:rPr>
+              <w:t>AMZN</w:t>
             </w:r>
           </w:p>
         </w:tc>
@@ -18478,11 +18478,11 @@
             <w:r>
               <w:rPr>
                 <w:rFonts w:ascii="Calibri" w:hAnsi="Calibri"/>
-                <w:b/>
-                <w:color w:val="1B365D"/>
-                <w:sz w:val="17"/>
-              </w:rPr>
-              <w:t>MercadoLibre, Inc.</w:t>
+                <w:b w:val="0"/>
+                <w:color w:val="2D3748"/>
+                <w:sz w:val="17"/>
+              </w:rPr>
+              <w:t>Amazon.com, Inc.</w:t>
             </w:r>
           </w:p>
         </w:tc>
@@ -18505,11 +18505,11 @@
             <w:r>
               <w:rPr>
                 <w:rFonts w:ascii="Calibri" w:hAnsi="Calibri"/>
-                <w:b/>
-                <w:color w:val="1B365D"/>
-                <w:sz w:val="17"/>
-              </w:rPr>
-              <w:t>LTM (FY2025 Auditado)</w:t>
+                <w:b w:val="0"/>
+                <w:color w:val="2D3748"/>
+                <w:sz w:val="17"/>
+              </w:rPr>
+              <w:t>LTM (FY2024 Auditado)</w:t>
             </w:r>
           </w:p>
         </w:tc>
@@ -18532,11 +18532,11 @@
             <w:r>
               <w:rPr>
                 <w:rFonts w:ascii="Calibri" w:hAnsi="Calibri"/>
-                <w:b/>
-                <w:color w:val="1B365D"/>
-                <w:sz w:val="17"/>
-              </w:rPr>
-              <w:t>68.71%</w:t>
+                <w:b w:val="0"/>
+                <w:color w:val="2D3748"/>
+                <w:sz w:val="17"/>
+              </w:rPr>
+              <w:t>54.46%</w:t>
             </w:r>
           </w:p>
         </w:tc>
@@ -18559,11 +18559,11 @@
             <w:r>
               <w:rPr>
                 <w:rFonts w:ascii="Calibri" w:hAnsi="Calibri"/>
-                <w:b/>
-                <w:color w:val="1B365D"/>
-                <w:sz w:val="17"/>
-              </w:rPr>
-              <w:t>84.59%</w:t>
+                <w:b w:val="0"/>
+                <w:color w:val="2D3748"/>
+                <w:sz w:val="17"/>
+              </w:rPr>
+              <w:t>64.62%</w:t>
             </w:r>
           </w:p>
         </w:tc>
@@ -18586,11 +18586,11 @@
             <w:r>
               <w:rPr>
                 <w:rFonts w:ascii="Calibri" w:hAnsi="Calibri"/>
-                <w:b/>
-                <w:color w:val="1B365D"/>
-                <w:sz w:val="17"/>
-              </w:rPr>
-              <w:t>61.38%</w:t>
+                <w:b w:val="0"/>
+                <w:color w:val="2D3748"/>
+                <w:sz w:val="17"/>
+              </w:rPr>
+              <w:t>49.18%</w:t>
             </w:r>
           </w:p>
         </w:tc>
@@ -18613,11 +18613,11 @@
             <w:r>
               <w:rPr>
                 <w:rFonts w:ascii="Calibri" w:hAnsi="Calibri"/>
-                <w:b/>
-                <w:color w:val="1B365D"/>
-                <w:sz w:val="17"/>
-              </w:rPr>
-              <w:t>1.12x</w:t>
+                <w:b w:val="0"/>
+                <w:color w:val="2D3748"/>
+                <w:sz w:val="17"/>
+              </w:rPr>
+              <w:t>1.11x</w:t>
             </w:r>
           </w:p>
         </w:tc>
@@ -18640,11 +18640,11 @@
             <w:r>
               <w:rPr>
                 <w:rFonts w:ascii="Calibri" w:hAnsi="Calibri"/>
-                <w:b/>
-                <w:color w:val="1B365D"/>
-                <w:sz w:val="17"/>
-              </w:rPr>
-              <w:t>+14.25 pp</w:t>
+                <w:b w:val="0"/>
+                <w:color w:val="2D3748"/>
+                <w:sz w:val="17"/>
+              </w:rPr>
+              <w:t>+0.00 pp</w:t>
             </w:r>
           </w:p>
         </w:tc>
@@ -18700,7 +18700,7 @@
                 <w:color w:val="2D3748"/>
                 <w:sz w:val="17"/>
               </w:rPr>
-              <w:t>AMZN</w:t>
+              <w:t>SE</w:t>
             </w:r>
           </w:p>
         </w:tc>
@@ -18727,7 +18727,7 @@
                 <w:color w:val="2D3748"/>
                 <w:sz w:val="17"/>
               </w:rPr>
-              <w:t>Amazon.com, Inc.</w:t>
+              <w:t>Sea Limited</w:t>
             </w:r>
           </w:p>
         </w:tc>
@@ -18781,7 +18781,7 @@
                 <w:color w:val="2D3748"/>
                 <w:sz w:val="17"/>
               </w:rPr>
-              <w:t>54.46%</w:t>
+              <w:t>53.91%</w:t>
             </w:r>
           </w:p>
         </w:tc>
@@ -18808,7 +18808,7 @@
                 <w:color w:val="2D3748"/>
                 <w:sz w:val="17"/>
               </w:rPr>
-              <w:t>64.62%</w:t>
+              <w:t>71.88%</w:t>
             </w:r>
           </w:p>
         </w:tc>
@@ -18835,7 +18835,7 @@
                 <w:color w:val="2D3748"/>
                 <w:sz w:val="17"/>
               </w:rPr>
-              <w:t>49.18%</w:t>
+              <w:t>43.67%</w:t>
             </w:r>
           </w:p>
         </w:tc>
@@ -18862,7 +18862,7 @@
                 <w:color w:val="2D3748"/>
                 <w:sz w:val="17"/>
               </w:rPr>
-              <w:t>1.11x</w:t>
+              <w:t>1.23x</w:t>
             </w:r>
           </w:p>
         </w:tc>
@@ -18889,7 +18889,7 @@
                 <w:color w:val="2D3748"/>
                 <w:sz w:val="17"/>
               </w:rPr>
-              <w:t>+0.00 pp</w:t>
+              <w:t>-0.56 pp</w:t>
             </w:r>
           </w:p>
         </w:tc>
@@ -18914,8 +18914,8 @@
             <w:r>
               <w:rPr>
                 <w:rFonts w:ascii="Calibri" w:hAnsi="Calibri"/>
-                <w:b w:val="0"/>
-                <w:color w:val="2D3748"/>
+                <w:b/>
+                <w:color w:val="1B365D"/>
                 <w:sz w:val="17"/>
               </w:rPr>
               <w:t>#3</w:t>
@@ -18941,11 +18941,11 @@
             <w:r>
               <w:rPr>
                 <w:rFonts w:ascii="Calibri" w:hAnsi="Calibri"/>
-                <w:b w:val="0"/>
-                <w:color w:val="2D3748"/>
-                <w:sz w:val="17"/>
-              </w:rPr>
-              <w:t>SE</w:t>
+                <w:b/>
+                <w:color w:val="1B365D"/>
+                <w:sz w:val="17"/>
+              </w:rPr>
+              <w:t>MELI</w:t>
             </w:r>
           </w:p>
         </w:tc>
@@ -18968,11 +18968,11 @@
             <w:r>
               <w:rPr>
                 <w:rFonts w:ascii="Calibri" w:hAnsi="Calibri"/>
-                <w:b w:val="0"/>
-                <w:color w:val="2D3748"/>
-                <w:sz w:val="17"/>
-              </w:rPr>
-              <w:t>Sea Limited</w:t>
+                <w:b/>
+                <w:color w:val="1B365D"/>
+                <w:sz w:val="17"/>
+              </w:rPr>
+              <w:t>MERCADOLIBRE INC</w:t>
             </w:r>
           </w:p>
         </w:tc>
@@ -18995,11 +18995,11 @@
             <w:r>
               <w:rPr>
                 <w:rFonts w:ascii="Calibri" w:hAnsi="Calibri"/>
-                <w:b w:val="0"/>
-                <w:color w:val="2D3748"/>
-                <w:sz w:val="17"/>
-              </w:rPr>
-              <w:t>LTM (FY2024 Auditado)</w:t>
+                <w:b/>
+                <w:color w:val="1B365D"/>
+                <w:sz w:val="17"/>
+              </w:rPr>
+              <w:t>LTM</w:t>
             </w:r>
           </w:p>
         </w:tc>
@@ -19022,11 +19022,11 @@
             <w:r>
               <w:rPr>
                 <w:rFonts w:ascii="Calibri" w:hAnsi="Calibri"/>
-                <w:b w:val="0"/>
-                <w:color w:val="2D3748"/>
-                <w:sz w:val="17"/>
-              </w:rPr>
-              <w:t>53.91%</w:t>
+                <w:b/>
+                <w:color w:val="1B365D"/>
+                <w:sz w:val="17"/>
+              </w:rPr>
+              <w:t>29.24%</w:t>
             </w:r>
           </w:p>
         </w:tc>
@@ -19049,11 +19049,11 @@
             <w:r>
               <w:rPr>
                 <w:rFonts w:ascii="Calibri" w:hAnsi="Calibri"/>
-                <w:b w:val="0"/>
-                <w:color w:val="2D3748"/>
-                <w:sz w:val="17"/>
-              </w:rPr>
-              <w:t>71.88%</w:t>
+                <w:b/>
+                <w:color w:val="1B365D"/>
+                <w:sz w:val="17"/>
+              </w:rPr>
+              <w:t>31.47%</w:t>
             </w:r>
           </w:p>
         </w:tc>
@@ -19076,11 +19076,11 @@
             <w:r>
               <w:rPr>
                 <w:rFonts w:ascii="Calibri" w:hAnsi="Calibri"/>
-                <w:b w:val="0"/>
-                <w:color w:val="2D3748"/>
-                <w:sz w:val="17"/>
-              </w:rPr>
-              <w:t>43.67%</w:t>
+                <w:b/>
+                <w:color w:val="1B365D"/>
+                <w:sz w:val="17"/>
+              </w:rPr>
+              <w:t>42.68%</w:t>
             </w:r>
           </w:p>
         </w:tc>
@@ -19103,11 +19103,11 @@
             <w:r>
               <w:rPr>
                 <w:rFonts w:ascii="Calibri" w:hAnsi="Calibri"/>
-                <w:b w:val="0"/>
-                <w:color w:val="2D3748"/>
-                <w:sz w:val="17"/>
-              </w:rPr>
-              <w:t>1.23x</w:t>
+                <w:b/>
+                <w:color w:val="1B365D"/>
+                <w:sz w:val="17"/>
+              </w:rPr>
+              <w:t>0.69x</w:t>
             </w:r>
           </w:p>
         </w:tc>
@@ -19130,11 +19130,11 @@
             <w:r>
               <w:rPr>
                 <w:rFonts w:ascii="Calibri" w:hAnsi="Calibri"/>
-                <w:b w:val="0"/>
-                <w:color w:val="2D3748"/>
-                <w:sz w:val="17"/>
-              </w:rPr>
-              <w:t>-0.56 pp</w:t>
+                <w:b/>
+                <w:color w:val="1B365D"/>
+                <w:sz w:val="17"/>
+              </w:rPr>
+              <w:t>-25.23 pp</w:t>
             </w:r>
           </w:p>
         </w:tc>
@@ -19721,7 +19721,7 @@
                 <w:color w:val="1B365D"/>
                 <w:sz w:val="21"/>
               </w:rPr>
-              <w:t>📌 DICTAMEN DE VALOR ECONÓMICO: ⚖️ RENDIMIENTO COMPETITIVO ESTÁNDAR (SPREAD +2.05 p.p.)</w:t>
+              <w:t>📌 DICTAMEN DE VALOR ECONÓMICO: 🏰 WIDE MOAT / COMPOUNDING MACHINE (SPREAD +16.69 p.p.)</w:t>
               <w:br/>
             </w:r>
           </w:p>
@@ -19735,7 +19735,7 @@
                 <w:color w:val="2D3748"/>
                 <w:sz w:val="19"/>
               </w:rPr>
-              <w:t>• ROC Greenblatt Tangible (LTM): 87.60% (Productividad operativa pura pre-tax sobre capital de trabajo y PP&amp;E físico instalado).</w:t>
+              <w:t>• ROC Greenblatt Tangible (LTM): 82.36% (Productividad operativa pura pre-tax sobre capital de trabajo y PP&amp;E físico instalado).</w:t>
             </w:r>
           </w:p>
           <w:p>
@@ -19748,7 +19748,7 @@
                 <w:color w:val="2D3748"/>
                 <w:sz w:val="19"/>
               </w:rPr>
-              <w:t>• ROIC Ajustado por Intangibles (LTM): 12.45% frente a un ROIC contable tradicional de 17.42%.</w:t>
+              <w:t>• ROIC Ajustado por Intangibles (LTM): 27.77% frente a un ROIC contable tradicional de 25.45%.</w:t>
             </w:r>
           </w:p>
           <w:p>
@@ -19761,7 +19761,7 @@
                 <w:color w:val="2D3748"/>
                 <w:sz w:val="19"/>
               </w:rPr>
-              <w:t>• Costo Promedio Ponderado de Capital (WACC): 10.40% (Costo del Equity Ke: 11.16%, Deuda Neta Kd: 3.74%).</w:t>
+              <w:t>• Costo Promedio Ponderado de Capital (WACC): 11.08% (Costo del Equity Ke: 11.70%, Deuda Neta Kd: 5.53%).</w:t>
             </w:r>
           </w:p>
           <w:p>
@@ -19774,7 +19774,7 @@
                 <w:color w:val="2D3748"/>
                 <w:sz w:val="19"/>
               </w:rPr>
-              <w:t>• Spread Económico Neto: +2.05 p.p. de rendimiento por encima del costo de capital exigido por el mercado.</w:t>
+              <w:t>• Spread Económico Neto: +16.69 p.p. de rendimiento por encima del costo de capital exigido por el mercado.</w:t>
             </w:r>
           </w:p>
           <w:p>
@@ -19800,7 +19800,7 @@
                 <w:color w:val="2D3748"/>
                 <w:sz w:val="19"/>
               </w:rPr>
-              <w:t>• Tesis de Foso Defensivo: El retorno (12.45%) apenas cubre el costo de financiamiento (10.40%), dejando un excedente marginal de +2.05 p.p. Opera en un entorno de alta competencia sin poder de fijación de precios.</w:t>
+              <w:t>• Tesis de Foso Defensivo: El negocio genera un retorno ajustado (27.77%) que supera a su costo de capital (11.08%) por más de 16.69 puntos porcentuales. Por cada $100 de capital empleado, crea más de $15 anuales de valor neto por encima de lo que exigen accionistas y bancos. Posee ventajas competitivas profundas y duraderas.</w:t>
             </w:r>
           </w:p>
         </w:tc>
@@ -19966,7 +19966,7 @@
               <w:rPr>
                 <w:sz w:val="17"/>
               </w:rPr>
-              <w:t>$1826.58</w:t>
+              <w:t>$1885.52</w:t>
             </w:r>
           </w:p>
         </w:tc>
@@ -20047,7 +20047,7 @@
               <w:rPr>
                 <w:sz w:val="17"/>
               </w:rPr>
-              <w:t>$92,602.7M</w:t>
+              <w:t>$95,590.6M</w:t>
             </w:r>
           </w:p>
         </w:tc>
@@ -20128,7 +20128,7 @@
               <w:rPr>
                 <w:sz w:val="17"/>
               </w:rPr>
-              <w:t>4.96%</w:t>
+              <w:t>5.22%</w:t>
             </w:r>
           </w:p>
         </w:tc>
@@ -20209,7 +20209,7 @@
               <w:rPr>
                 <w:sz w:val="17"/>
               </w:rPr>
-              <w:t>1.31</w:t>
+              <w:t>1.36</w:t>
             </w:r>
           </w:p>
         </w:tc>
@@ -20348,7 +20348,7 @@
         <w:rPr>
           <w:sz w:val="19"/>
         </w:rPr>
-        <w:t>El Return on Capital (ROC) de Joel Greenblatt evalúa la rentabilidad operativa pura antes de impuestos (EBIT) sobre los activos físicos tangibles (Capital de Trabajo Neto Operativo + PP&amp;E Físico). Para MercadoLibre, Inc., el ROC de 87.60% refleja un modelo extraordinariamente Asset-Light, donde los proveedores financian el circulante (NWC negativo) y la manufactura es subcontratada, rindiendo más de $3.00 de beneficio por dólar instalado.</w:t>
+        <w:t>El Return on Capital (ROC) de Joel Greenblatt evalúa la rentabilidad operativa pura antes de impuestos (EBIT) sobre los activos físicos tangibles (Capital de Trabajo Neto Operativo + PP&amp;E Físico). Para MercadoLibre, Inc., el ROC de 82.36% refleja la eficiencia operativa sobre activos tangibles instalados, optimizando la rotación de capital y la productividad física instalada.</w:t>
       </w:r>
     </w:p>
     <w:tbl>
@@ -20928,7 +20928,7 @@
                 <w:b/>
                 <w:sz w:val="17"/>
               </w:rPr>
-              <w:t>$2,303.0M</w:t>
+              <w:t>$2,725.0M</w:t>
             </w:r>
           </w:p>
         </w:tc>
@@ -21029,7 +21029,7 @@
                 <w:b/>
                 <w:sz w:val="17"/>
               </w:rPr>
-              <w:t>$3,064.0M</w:t>
+              <w:t>$3,486.0M</w:t>
             </w:r>
           </w:p>
         </w:tc>
@@ -21131,7 +21131,7 @@
                 <w:b/>
                 <w:sz w:val="17"/>
               </w:rPr>
-              <w:t>$3,318.5M</w:t>
+              <w:t>$3,529.5M</w:t>
             </w:r>
           </w:p>
         </w:tc>
@@ -21234,7 +21234,7 @@
                 <w:b/>
                 <w:sz w:val="17"/>
               </w:rPr>
-              <w:t>87.60%</w:t>
+              <w:t>82.36%</w:t>
             </w:r>
           </w:p>
         </w:tc>
@@ -21435,7 +21435,7 @@
         <w:rPr>
           <w:sz w:val="19"/>
         </w:rPr>
-        <w:t>El ROIC Tradicional contable (17.42%) sobrestima el retorno al mandar el I+D a gasto inmediato. La metodología Damodaran capitaliza la innovación a 3 años, reconociendo $7,451.2M de intangibles fuera de balance. El ROIC Ajustado resultante de 12.45% refleja el verdadero retorno económico sobre el capital total invertido ($18,300.7M).</w:t>
+        <w:t>El ROIC Tradicional contable (25.45%) sobrestima el retorno al mandar el I+D a gasto inmediato. La metodología Damodaran capitaliza la innovación a 3 años, reconociendo $7,451.2M de intangibles fuera de balance. El ROIC Ajustado resultante de 27.77% refleja el verdadero retorno económico sobre el capital total invertido ($18,300.7M).</w:t>
       </w:r>
     </w:p>
     <w:tbl>
@@ -21654,7 +21654,7 @@
                 <w:b/>
                 <w:sz w:val="17"/>
               </w:rPr>
-              <w:t>73.51%</w:t>
+              <w:t>73.58%</w:t>
             </w:r>
           </w:p>
         </w:tc>
@@ -21674,7 +21674,7 @@
                 <w:b/>
                 <w:sz w:val="17"/>
               </w:rPr>
-              <w:t>21.11%</w:t>
+              <w:t>30.88%</w:t>
             </w:r>
           </w:p>
         </w:tc>
@@ -21694,7 +21694,7 @@
                 <w:b/>
                 <w:sz w:val="17"/>
               </w:rPr>
-              <w:t>25.19%</w:t>
+              <w:t>36.82%</w:t>
             </w:r>
           </w:p>
         </w:tc>
@@ -21713,7 +21713,7 @@
               <w:rPr>
                 <w:sz w:val="17"/>
               </w:rPr>
-              <w:t>$1,738.7M</w:t>
+              <w:t>$1,738.6M</w:t>
             </w:r>
           </w:p>
         </w:tc>
@@ -21732,7 +21732,7 @@
               <w:rPr>
                 <w:sz w:val="17"/>
               </w:rPr>
-              <w:t>$2,777.7M</w:t>
+              <w:t>$2,777.4M</w:t>
             </w:r>
           </w:p>
         </w:tc>
@@ -21752,7 +21752,7 @@
                 <w:b/>
                 <w:sz w:val="17"/>
               </w:rPr>
-              <w:t>+14.79 p.p.</w:t>
+              <w:t>+25.74 p.p.</w:t>
             </w:r>
           </w:p>
         </w:tc>
@@ -21795,7 +21795,7 @@
                 <w:b/>
                 <w:sz w:val="17"/>
               </w:rPr>
-              <w:t>90.65%</w:t>
+              <w:t>93.73%</w:t>
             </w:r>
           </w:p>
         </w:tc>
@@ -21816,7 +21816,7 @@
                 <w:b/>
                 <w:sz w:val="17"/>
               </w:rPr>
-              <w:t>27.19%</w:t>
+              <w:t>41.09%</w:t>
             </w:r>
           </w:p>
         </w:tc>
@@ -21837,7 +21837,7 @@
                 <w:b/>
                 <w:sz w:val="17"/>
               </w:rPr>
-              <w:t>30.44%</w:t>
+              <w:t>45.18%</w:t>
             </w:r>
           </w:p>
         </w:tc>
@@ -21877,7 +21877,7 @@
               <w:rPr>
                 <w:sz w:val="17"/>
               </w:rPr>
-              <w:t>$4,822.7M</w:t>
+              <w:t>$4,822.2M</w:t>
             </w:r>
           </w:p>
         </w:tc>
@@ -21898,7 +21898,7 @@
                 <w:b/>
                 <w:sz w:val="17"/>
               </w:rPr>
-              <w:t>+20.04 p.p.</w:t>
+              <w:t>+34.09 p.p.</w:t>
             </w:r>
           </w:p>
         </w:tc>
@@ -21939,7 +21939,7 @@
                 <w:b/>
                 <w:sz w:val="17"/>
               </w:rPr>
-              <w:t>115.20%</w:t>
+              <w:t>139.46%</w:t>
             </w:r>
           </w:p>
         </w:tc>
@@ -21959,7 +21959,7 @@
                 <w:b/>
                 <w:sz w:val="17"/>
               </w:rPr>
-              <w:t>33.58%</w:t>
+              <w:t>59.42%</w:t>
             </w:r>
           </w:p>
         </w:tc>
@@ -21979,7 +21979,7 @@
                 <w:b/>
                 <w:sz w:val="17"/>
               </w:rPr>
-              <w:t>30.92%</w:t>
+              <w:t>50.17%</w:t>
             </w:r>
           </w:p>
         </w:tc>
@@ -21998,7 +21998,7 @@
               <w:rPr>
                 <w:sz w:val="17"/>
               </w:rPr>
-              <w:t>$4,622.3M</w:t>
+              <w:t>$4,622.2M</w:t>
             </w:r>
           </w:p>
         </w:tc>
@@ -22017,7 +22017,7 @@
               <w:rPr>
                 <w:sz w:val="17"/>
               </w:rPr>
-              <w:t>$7,321.1M</w:t>
+              <w:t>$7,321.0M</w:t>
             </w:r>
           </w:p>
         </w:tc>
@@ -22037,7 +22037,7 @@
                 <w:b/>
                 <w:sz w:val="17"/>
               </w:rPr>
-              <w:t>+20.52 p.p.</w:t>
+              <w:t>+39.09 p.p.</w:t>
             </w:r>
           </w:p>
         </w:tc>
@@ -22101,7 +22101,7 @@
                 <w:b/>
                 <w:sz w:val="17"/>
               </w:rPr>
-              <w:t>42.40%</w:t>
+              <w:t>51.27%</w:t>
             </w:r>
           </w:p>
         </w:tc>
@@ -22122,7 +22122,7 @@
                 <w:b/>
                 <w:sz w:val="17"/>
               </w:rPr>
-              <w:t>30.49%</w:t>
+              <w:t>36.86%</w:t>
             </w:r>
           </w:p>
         </w:tc>
@@ -22183,7 +22183,7 @@
                 <w:b/>
                 <w:sz w:val="17"/>
               </w:rPr>
-              <w:t>+20.09 p.p.</w:t>
+              <w:t>+25.78 p.p.</w:t>
             </w:r>
           </w:p>
         </w:tc>
@@ -22244,7 +22244,7 @@
                 <w:b/>
                 <w:sz w:val="17"/>
               </w:rPr>
-              <w:t>27.56%</w:t>
+              <w:t>37.26%</w:t>
             </w:r>
           </w:p>
         </w:tc>
@@ -22264,7 +22264,7 @@
                 <w:b/>
                 <w:sz w:val="17"/>
               </w:rPr>
-              <w:t>22.34%</w:t>
+              <w:t>30.20%</w:t>
             </w:r>
           </w:p>
         </w:tc>
@@ -22322,7 +22322,7 @@
                 <w:b/>
                 <w:sz w:val="17"/>
               </w:rPr>
-              <w:t>+11.94 p.p.</w:t>
+              <w:t>+19.12 p.p.</w:t>
             </w:r>
           </w:p>
         </w:tc>
@@ -22367,7 +22367,7 @@
                 <w:b/>
                 <w:sz w:val="17"/>
               </w:rPr>
-              <w:t>87.60%</w:t>
+              <w:t>82.36%</w:t>
             </w:r>
           </w:p>
         </w:tc>
@@ -22389,7 +22389,7 @@
                 <w:b/>
                 <w:sz w:val="17"/>
               </w:rPr>
-              <w:t>17.42%</w:t>
+              <w:t>25.45%</w:t>
             </w:r>
           </w:p>
         </w:tc>
@@ -22411,7 +22411,7 @@
                 <w:b/>
                 <w:sz w:val="17"/>
               </w:rPr>
-              <w:t>12.45%</w:t>
+              <w:t>27.77%</w:t>
             </w:r>
           </w:p>
         </w:tc>
@@ -22475,7 +22475,7 @@
                 <w:b/>
                 <w:sz w:val="17"/>
               </w:rPr>
-              <w:t>+2.05 p.p.</w:t>
+              <w:t>+16.69 p.p.</w:t>
             </w:r>
           </w:p>
         </w:tc>
@@ -22490,7 +22490,7 @@
           <w:i/>
           <w:sz w:val="18"/>
         </w:rPr>
-        <w:t>Matriz de Sensibilidad de Vida Útil: N-1 (2a) = 12.14% | N Base (3a) = 12.45% | N+1 (4a) = 12.85%.</w:t>
+        <w:t>Matriz de Sensibilidad de Vida Útil: N-1 (2a) = 27.84% | N Base (3a) = 27.77% | N+1 (4a) = 27.98%.</w:t>
       </w:r>
     </w:p>
     <w:p>
@@ -22506,9 +22506,9 @@
         <w:rPr>
           <w:sz w:val="19"/>
         </w:rPr>
-        <w:t>Spread Económico = ROIC Ajustado (12.45%) − WACC (10.40%) = +2.05 p.p.</w:t>
+        <w:t>Spread Económico = ROIC Ajustado (27.77%) − WACC (11.08%) = +16.69 p.p.</w:t>
         <w:br/>
-        <w:t>Dictamen: ⚖️ RENDIMIENTO COMPETITIVO ESTÁNDAR. La compañía supera holgadamente su costo de capital, generando más de $2.05 anuales de valor neto por cada $100 invertidos.</w:t>
+        <w:t>Dictamen: 🏰 WIDE MOAT / COMPOUNDING MACHINE. La compañía supera holgadamente su costo de capital, generando retornos netos excedentes sobre cada dólar invertido.</w:t>
       </w:r>
     </w:p>
     <w:p>
@@ -22709,7 +22709,7 @@
                 <w:b/>
                 <w:sz w:val="17"/>
               </w:rPr>
-              <w:t>4.96%</w:t>
+              <w:t>5.22%</w:t>
             </w:r>
           </w:p>
         </w:tc>
@@ -22811,7 +22811,7 @@
                 <w:b/>
                 <w:sz w:val="17"/>
               </w:rPr>
-              <w:t>1.31</w:t>
+              <w:t>1.36</w:t>
             </w:r>
           </w:p>
         </w:tc>
@@ -23014,7 +23014,7 @@
                 <w:b/>
                 <w:sz w:val="17"/>
               </w:rPr>
-              <w:t>11.16%</w:t>
+              <w:t>11.70%</w:t>
             </w:r>
           </w:p>
         </w:tc>
@@ -23115,7 +23115,7 @@
                 <w:b/>
                 <w:sz w:val="17"/>
               </w:rPr>
-              <w:t>3.74%</w:t>
+              <w:t>5.53%</w:t>
             </w:r>
           </w:p>
         </w:tc>
@@ -23153,7 +23153,7 @@
               <w:rPr>
                 <w:sz w:val="17"/>
               </w:rPr>
-              <w:t>Financiación crediticia con escudo fiscal del 35.0%.</w:t>
+              <w:t>Financiación crediticia con escudo fiscal del 5.0%.</w:t>
             </w:r>
           </w:p>
         </w:tc>
@@ -23217,7 +23217,7 @@
                 <w:b/>
                 <w:sz w:val="17"/>
               </w:rPr>
-              <w:t>10.40%</w:t>
+              <w:t>11.08%</w:t>
             </w:r>
           </w:p>
         </w:tc>
@@ -23321,7 +23321,7 @@
                 <w:b/>
                 <w:sz w:val="17"/>
               </w:rPr>
-              <w:t>87.60%</w:t>
+              <w:t>82.36%</w:t>
             </w:r>
           </w:p>
         </w:tc>
@@ -23341,7 +23341,7 @@
               <w:rPr>
                 <w:sz w:val="17"/>
               </w:rPr>
-              <w:t>Mediana Sector (29.85%)</w:t>
+              <w:t>Mediana Sector (32.00%)</w:t>
             </w:r>
           </w:p>
         </w:tc>
@@ -23361,7 +23361,7 @@
               <w:rPr>
                 <w:sz w:val="17"/>
               </w:rPr>
-              <w:t>Asset-Light extremo; supera al sector por ++57.7 pp.</w:t>
+              <w:t>Asset-Light; supera al sector por +50.36 p.p..</w:t>
             </w:r>
           </w:p>
         </w:tc>
@@ -23425,7 +23425,7 @@
                 <w:b/>
                 <w:sz w:val="17"/>
               </w:rPr>
-              <w:t>$3,318.5M</w:t>
+              <w:t>$3,529.5M</w:t>
             </w:r>
           </w:p>
         </w:tc>
@@ -23465,7 +23465,7 @@
               <w:rPr>
                 <w:sz w:val="17"/>
               </w:rPr>
-              <w:t>Base física mínima gracias a capital de trabajo negativo.</w:t>
+              <w:t>Base física operativa mínima tras salvaguardas.</w:t>
             </w:r>
           </w:p>
         </w:tc>
@@ -23526,7 +23526,7 @@
                 <w:b/>
                 <w:sz w:val="17"/>
               </w:rPr>
-              <w:t>17.42%</w:t>
+              <w:t>25.45%</w:t>
             </w:r>
           </w:p>
         </w:tc>
@@ -23835,7 +23835,7 @@
                 <w:b/>
                 <w:sz w:val="17"/>
               </w:rPr>
-              <w:t>12.45%</w:t>
+              <w:t>27.77%</w:t>
             </w:r>
           </w:p>
         </w:tc>
@@ -23857,7 +23857,7 @@
                 <w:b/>
                 <w:sz w:val="17"/>
               </w:rPr>
-              <w:t>Mediana Sector (18.30%)</w:t>
+              <w:t>Mediana Sector (17.20%)</w:t>
             </w:r>
           </w:p>
         </w:tc>
@@ -23944,7 +23944,7 @@
                 <w:b/>
                 <w:sz w:val="17"/>
               </w:rPr>
-              <w:t>+2.05 pp</w:t>
+              <w:t>+16.69 p.p.</w:t>
             </w:r>
           </w:p>
         </w:tc>
@@ -23965,7 +23965,7 @@
                 <w:b/>
                 <w:sz w:val="17"/>
               </w:rPr>
-              <w:t>Mediana Sector (+9.20 pp)</w:t>
+              <w:t>Mediana Sector (+8.00 p.p.)</w:t>
             </w:r>
           </w:p>
         </w:tc>
@@ -24050,7 +24050,7 @@
                 <w:b/>
                 <w:sz w:val="17"/>
               </w:rPr>
-              <w:t>⚖️ RENDIMIENTO COMPETITIVO ESTÁNDAR</w:t>
+              <w:t>🏰 WIDE MOAT / COMPOUNDING MACHINE</w:t>
             </w:r>
           </w:p>
         </w:tc>
@@ -24124,7 +24124,7 @@
           <w:color w:val="1B365D"/>
           <w:sz w:val="21"/>
         </w:rPr>
-        <w:t>DICTAMEN FORENSE INSTITUCIONAL (LTM): ZONA DE VIGILANCIA</w:t>
+        <w:t>DICTAMEN FORENSE INSTITUCIONAL (LTM): ALERTA FORENSE</w:t>
         <w:br/>
       </w:r>
       <w:r>
@@ -24135,9 +24135,9 @@
         </w:rPr>
         <w:t>• Ratio Sloan de Devengos: -25.62% [ALTA CONVERSIÓN DE CAJA (CFO &gt; NI)]</w:t>
         <w:br/>
-        <w:t>• Montier C-Score: 3 / 6 [RIESGO MODERADO / ALERTA PREVENTIVA (&lt; 5% PROBABILIDAD DE MANIPULACIÓN)]</w:t>
+        <w:t>• Montier C-Score: 4 / 6 [RIESGO ALTO / ALERTA FORENSE (&gt; 70% ALERTA FORENSE)]</w:t>
         <w:br/>
-        <w:t>• Dictamen: ZONA DE VIGILANCIA POR DESFASES OPERATIVOS: Montier C-Score de 3/6 con divergencias puntuales en capital de trabajo. Revisar ciclos estacionales de inventarios y condiciones comerciales de cobro.</w:t>
+        <w:t>• Dictamen: ALERTA FORENSE POR CALIDAD DE RESULTADOS: Detección de devengos desproporcionados (Ratio Sloan: -25.62%) o Montier C-Score elevado (4/6). Se recomienda auditoría minuciosa de políticas contables, partidas no monetarias y devengos acumulados.</w:t>
       </w:r>
     </w:p>
     <w:p>
@@ -24982,7 +24982,7 @@
                 <w:b w:val="0"/>
                 <w:sz w:val="17"/>
               </w:rPr>
-              <w:t>$21,421.0M</w:t>
+              <w:t>$21,404.0M</w:t>
             </w:r>
           </w:p>
         </w:tc>
@@ -25006,7 +25006,7 @@
                 <w:b w:val="0"/>
                 <w:sz w:val="17"/>
               </w:rPr>
-              <w:t>$15,691.0M</w:t>
+              <w:t>$15,674.0M</w:t>
             </w:r>
           </w:p>
         </w:tc>
@@ -25030,7 +25030,7 @@
                 <w:b w:val="0"/>
                 <w:sz w:val="17"/>
               </w:rPr>
-              <w:t>$11,918.6M</w:t>
+              <w:t>$11,918.5M</w:t>
             </w:r>
           </w:p>
         </w:tc>
@@ -25149,7 +25149,7 @@
                 <w:b/>
                 <w:sz w:val="17"/>
               </w:rPr>
-              <w:t>-28.04%</w:t>
+              <w:t>-28.06%</w:t>
             </w:r>
           </w:p>
         </w:tc>
@@ -25173,7 +25173,7 @@
                 <w:b/>
                 <w:sz w:val="17"/>
               </w:rPr>
-              <w:t>-26.47%</w:t>
+              <w:t>-26.50%</w:t>
             </w:r>
           </w:p>
         </w:tc>
@@ -25405,7 +25405,7 @@
           <w:color w:val="2D3748"/>
           <w:sz w:val="17"/>
         </w:rPr>
-        <w:t>Interpretación para el Inversor: En LTM, MercadoLibre, Inc. generó $13.9B de CFO frente a $1.9B de beneficio neto, arrojando una tasa de conversión de caja del 746.4% (cada dólar reportado está respaldado por $7.46 de efectivo). El Ratio Sloan de -25.62% descarta por completo el riesgo de beneficios ficticios.</w:t>
+        <w:t>Interpretación para el Inversor: En LTM, MercadoLibre, Inc. generó $13,905.0M de CFO frente a $1,863.0M de beneficio neto, arrojando una tasa de conversión de caja del 746.4% (cada dólar reportado está respaldado por $7.46 de efectivo). El Ratio Sloan de -25.62% descarta por completo el riesgo de beneficios ficticios.</w:t>
       </w:r>
     </w:p>
     <w:p>
@@ -25775,7 +25775,7 @@
                 <w:rFonts w:ascii="Calibri" w:hAnsi="Calibri"/>
                 <w:sz w:val="17"/>
               </w:rPr>
-              <w:t>+70.0%</w:t>
+              <w:t>+18.4%</w:t>
             </w:r>
           </w:p>
         </w:tc>
@@ -25798,7 +25798,7 @@
                 <w:rFonts w:ascii="Calibri" w:hAnsi="Calibri"/>
                 <w:sz w:val="17"/>
               </w:rPr>
-              <w:t>DIO: 25.2d (+12.2d)</w:t>
+              <w:t>DIO: 14.9d (+1.9d)</w:t>
             </w:r>
           </w:p>
         </w:tc>
@@ -25895,7 +25895,7 @@
                 <w:rFonts w:ascii="Calibri" w:hAnsi="Calibri"/>
                 <w:sz w:val="17"/>
               </w:rPr>
-              <w:t>88.4%</w:t>
+              <w:t>87.6%</w:t>
             </w:r>
           </w:p>
         </w:tc>
@@ -25918,7 +25918,7 @@
                 <w:rFonts w:ascii="Calibri" w:hAnsi="Calibri"/>
                 <w:sz w:val="17"/>
               </w:rPr>
-              <w:t>Δ: +2.4 pp</w:t>
+              <w:t>Δ: +1.6 pp</w:t>
             </w:r>
           </w:p>
         </w:tc>
@@ -25960,7 +25960,7 @@
           <w:color w:val="2D3748"/>
           <w:sz w:val="17"/>
         </w:rPr>
-        <w:t>Nota Forense sobre Inventario (MELI): Las existencias crecen 70.0% por encima del coste de ventas, elevando el inventario en +12.2 días (DIO: 25.2d). Evaluar si responde a preparación estacional de lanzamientos o acumulación no vendida.</w:t>
+        <w:t>Nota Forense sobre Inventario (MercadoLibre, Inc.): Inventario en sintonía con la cadencia de costes (Spread: 18.4%, DIO: 14.9d). Existencias optimizadas.</w:t>
       </w:r>
     </w:p>
     <w:p>
@@ -25974,7 +25974,7 @@
           <w:color w:val="1B365D"/>
           <w:sz w:val="23"/>
         </w:rPr>
-        <w:t>12.3. Desglose Forense Montier C-Score (3/6 Banderas)</w:t>
+        <w:t>12.3. Desglose Forense Montier C-Score (4 / 6)</w:t>
       </w:r>
     </w:p>
     <w:p>
@@ -26282,7 +26282,7 @@
                 <w:rFonts w:ascii="Calibri" w:hAnsi="Calibri"/>
                 <w:sz w:val="16"/>
               </w:rPr>
-              <w:t>2. Cuentas por Cobrar vs. Ventas</w:t>
+              <w:t>2. Cuentas por Cobrar vs. Ventas (DSO)</w:t>
             </w:r>
           </w:p>
         </w:tc>
@@ -26305,7 +26305,7 @@
                 <w:rFonts w:ascii="Calibri" w:hAnsi="Calibri"/>
                 <w:sz w:val="16"/>
               </w:rPr>
-              <w:t>Δ Cuentas por Cobrar % &gt; Δ Ventas %</w:t>
+              <w:t>Δ DSO &gt; 0 (o %Δ Cuentas por Cobrar &gt; %Δ Ventas)</w:t>
             </w:r>
           </w:p>
         </w:tc>
@@ -26328,7 +26328,7 @@
                 <w:rFonts w:ascii="Calibri" w:hAnsi="Calibri"/>
                 <w:sz w:val="16"/>
               </w:rPr>
-              <w:t>ΔAR: 13.3% vs ΔVentas: 21.8%</w:t>
+              <w:t>DSO: 4.3d (Δ: -0.3d)</w:t>
             </w:r>
           </w:p>
         </w:tc>
@@ -26376,7 +26376,7 @@
                 <w:rFonts w:ascii="Calibri" w:hAnsi="Calibri"/>
                 <w:sz w:val="16"/>
               </w:rPr>
-              <w:t>Las cuentas a cobrar crecen más rápido que las ventas. Indica relajación de cobros o facturación apresurada (channel stuffing).</w:t>
+              <w:t>El plazo de cobro se dilata o las cuentas a cobrar crecen más rápido que las ventas. Indica relajación de cobros o facturación apresurada (channel stuffing).</w:t>
             </w:r>
           </w:p>
         </w:tc>
@@ -26401,7 +26401,7 @@
                 <w:rFonts w:ascii="Calibri" w:hAnsi="Calibri"/>
                 <w:sz w:val="16"/>
               </w:rPr>
-              <w:t>3. Inventarios vs. Coste de Ventas</w:t>
+              <w:t>3. Inventarios vs. Coste de Ventas (DIO)</w:t>
             </w:r>
           </w:p>
         </w:tc>
@@ -26424,7 +26424,7 @@
                 <w:rFonts w:ascii="Calibri" w:hAnsi="Calibri"/>
                 <w:sz w:val="16"/>
               </w:rPr>
-              <w:t>Δ Inventarios % &gt; Δ Coste de Ventas %</w:t>
+              <w:t>Δ DIO &gt; 0 (o %Δ Inventarios &gt; %Δ Coste de Ventas)</w:t>
             </w:r>
           </w:p>
         </w:tc>
@@ -26447,7 +26447,7 @@
                 <w:rFonts w:ascii="Calibri" w:hAnsi="Calibri"/>
                 <w:sz w:val="16"/>
               </w:rPr>
-              <w:t>ΔInv: 44.2% vs ΔCOGS: -25.8%</w:t>
+              <w:t>DIO: 14.9d (Δ: +1.9d)</w:t>
             </w:r>
           </w:p>
         </w:tc>
@@ -26495,7 +26495,7 @@
                 <w:rFonts w:ascii="Calibri" w:hAnsi="Calibri"/>
                 <w:sz w:val="16"/>
               </w:rPr>
-              <w:t>Las existencias crecen más rápido que los costes de venta. Puede esconder producto no vendido o absorción de costes en inventario para inflar márgenes.</w:t>
+              <w:t>Las existencias rotan más lento o crecen más rápido que los costes. Puede esconder producto no vendido o absorción de costes en inventario para inflar márgenes.</w:t>
             </w:r>
           </w:p>
         </w:tc>
@@ -26520,7 +26520,7 @@
                 <w:rFonts w:ascii="Calibri" w:hAnsi="Calibri"/>
                 <w:sz w:val="16"/>
               </w:rPr>
-              <w:t>4. Deterioro del Margen Bruto</w:t>
+              <w:t>4. Otros Activos Corrientes vs. Ventas</w:t>
             </w:r>
           </w:p>
         </w:tc>
@@ -26543,7 +26543,7 @@
                 <w:rFonts w:ascii="Calibri" w:hAnsi="Calibri"/>
                 <w:sz w:val="16"/>
               </w:rPr>
-              <w:t>Margen Bruto_t &lt; Margen Bruto_t-1</w:t>
+              <w:t>Ratio Otros Act. Ctes/Ventas_t &gt; Ratio Otros Act. Ctes/Ventas_t-1</w:t>
             </w:r>
           </w:p>
         </w:tc>
@@ -26566,7 +26566,7 @@
                 <w:rFonts w:ascii="Calibri" w:hAnsi="Calibri"/>
                 <w:sz w:val="16"/>
               </w:rPr>
-              <w:t>Margen Bruto: 42.68% vs 44.5%</w:t>
+              <w:t>Otros Act/Ventas: 2.66% vs 2.49%</w:t>
             </w:r>
           </w:p>
         </w:tc>
@@ -26614,7 +26614,7 @@
                 <w:rFonts w:ascii="Calibri" w:hAnsi="Calibri"/>
                 <w:sz w:val="16"/>
               </w:rPr>
-              <w:t>El deterioro del margen bruto genera incentivos en los ejecutivos para estirar partidas contables inferiores.</w:t>
+              <w:t>Incremento del peso relativo de otros activos corrientes. Alerta de partidas dudosas o cargos diferidos ocultos fuera de clientes e inventarios.</w:t>
             </w:r>
           </w:p>
         </w:tc>
@@ -26639,7 +26639,7 @@
                 <w:rFonts w:ascii="Calibri" w:hAnsi="Calibri"/>
                 <w:sz w:val="16"/>
               </w:rPr>
-              <w:t>5. Incremento de Activos Blandos</w:t>
+              <w:t>5. Reducción de la Tasa de Depreciación</w:t>
             </w:r>
           </w:p>
         </w:tc>
@@ -26662,7 +26662,7 @@
                 <w:rFonts w:ascii="Calibri" w:hAnsi="Calibri"/>
                 <w:sz w:val="16"/>
               </w:rPr>
-              <w:t>Ratio Activos Blandos_t &gt; Ratio Activos Blandos_t-1</w:t>
+              <w:t>Tasa Depreciación_t &lt; Tasa Depreciación_t-1</w:t>
             </w:r>
           </w:p>
         </w:tc>
@@ -26685,7 +26685,7 @@
                 <w:rFonts w:ascii="Calibri" w:hAnsi="Calibri"/>
                 <w:sz w:val="16"/>
               </w:rPr>
-              <w:t>Activos Blandos: 88.4% vs 86.0%</w:t>
+              <w:t>Tasa Deprec: 23.09% vs 26.21%</w:t>
             </w:r>
           </w:p>
         </w:tc>
@@ -26733,7 +26733,7 @@
                 <w:rFonts w:ascii="Calibri" w:hAnsi="Calibri"/>
                 <w:sz w:val="16"/>
               </w:rPr>
-              <w:t>Aumento del peso relativo de partidas del balance que no son activos productivos tangibles ni tesorería.</w:t>
+              <w:t>Reducción de la amortización contable respecto a los activos brutos, inflando el beneficio neto al estirar vidas útiles estimadas.</w:t>
             </w:r>
           </w:p>
         </w:tc>
@@ -26758,7 +26758,7 @@
                 <w:rFonts w:ascii="Calibri" w:hAnsi="Calibri"/>
                 <w:sz w:val="16"/>
               </w:rPr>
-              <w:t>6. Reducción de la Tasa de Depreciación</w:t>
+              <w:t>6. Crecimiento Excesivo de Activos Totales</w:t>
             </w:r>
           </w:p>
         </w:tc>
@@ -26781,7 +26781,7 @@
                 <w:rFonts w:ascii="Calibri" w:hAnsi="Calibri"/>
                 <w:sz w:val="16"/>
               </w:rPr>
-              <w:t>Tasa Depreciación_t &lt; Tasa Depreciación_t-1</w:t>
+              <w:t>Crecimiento Interanual de Activos Totales &gt; 10.0%</w:t>
             </w:r>
           </w:p>
         </w:tc>
@@ -26804,7 +26804,7 @@
                 <w:rFonts w:ascii="Calibri" w:hAnsi="Calibri"/>
                 <w:sz w:val="16"/>
               </w:rPr>
-              <w:t>Tasa Deprec: 26.21% vs 26.21%</w:t>
+              <w:t>ΔActivos: +20.4% (Umbral: &gt; 10%)</w:t>
             </w:r>
           </w:p>
         </w:tc>
@@ -26826,10 +26826,10 @@
               <w:rPr>
                 <w:rFonts w:ascii="Calibri" w:hAnsi="Calibri"/>
                 <w:b/>
-                <w:color w:val="276A3C"/>
+                <w:color w:val="C00000"/>
                 <w:sz w:val="16"/>
               </w:rPr>
-              <w:t>✅ OK</w:t>
+              <w:t>🚩 FLAG</w:t>
             </w:r>
           </w:p>
         </w:tc>
@@ -26852,7 +26852,7 @@
                 <w:rFonts w:ascii="Calibri" w:hAnsi="Calibri"/>
                 <w:sz w:val="16"/>
               </w:rPr>
-              <w:t>Reducción de la amortización contable respecto a los activos brutos, inflando el beneficio neto al estirar vidas útiles.</w:t>
+              <w:t>Expansión acelerada de balance o adquisiciones seriales (M&amp;A). Montier advierte que suele utilizarse para disimular debilidad orgánica y distorsionar resultados.</w:t>
             </w:r>
           </w:p>
         </w:tc>
@@ -26869,7 +26869,7 @@
           <w:color w:val="1B365D"/>
           <w:sz w:val="17"/>
         </w:rPr>
-        <w:t>Dictamen Montier: 3 / 6 Banderas — RIESGO MODERADO / ALERTA PREVENTIVA. Probabilidad empírica de manipulación moderada (&lt; 25%).</w:t>
+        <w:t>Dictamen Montier: 4 / 6 Banderas — RIESGO ALTO / ALERTA FORENSE. Probabilidad empírica de manipulación &gt; 70%.</w:t>
       </w:r>
     </w:p>
     <w:p>
@@ -27464,7 +27464,7 @@
                 <w:rFonts w:ascii="Calibri" w:hAnsi="Calibri"/>
                 <w:sz w:val="17"/>
               </w:rPr>
-              <w:t>25.2 días</w:t>
+              <w:t>14.9 días</w:t>
             </w:r>
           </w:p>
         </w:tc>
@@ -27510,7 +27510,7 @@
                 <w:rFonts w:ascii="Calibri" w:hAnsi="Calibri"/>
                 <w:sz w:val="17"/>
               </w:rPr>
-              <w:t>Rotación ultra-rápida (25.2d); mínima inmovilización de capital.</w:t>
+              <w:t>Rotación ultra-rápida (14.9d); mínima inmovilización de capital.</w:t>
             </w:r>
           </w:p>
         </w:tc>
@@ -27583,7 +27583,7 @@
                 <w:rFonts w:ascii="Calibri" w:hAnsi="Calibri"/>
                 <w:sz w:val="17"/>
               </w:rPr>
-              <w:t>+2.4 pp</w:t>
+              <w:t>+1.6 pp</w:t>
             </w:r>
           </w:p>
         </w:tc>
@@ -27629,7 +27629,7 @@
                 <w:rFonts w:ascii="Calibri" w:hAnsi="Calibri"/>
                 <w:sz w:val="17"/>
               </w:rPr>
-              <w:t>Alerta (+2.4 pp): Aumento en activos no físicos; auditar intangibles.</w:t>
+              <w:t>Cero distorsión; gastos operativos no se activan en el balance.</w:t>
             </w:r>
           </w:p>
         </w:tc>
@@ -27702,7 +27702,7 @@
                 <w:rFonts w:ascii="Calibri" w:hAnsi="Calibri"/>
                 <w:sz w:val="17"/>
               </w:rPr>
-              <w:t>3 / 6</w:t>
+              <w:t>4 / 6</w:t>
             </w:r>
           </w:p>
         </w:tc>
@@ -27748,7 +27748,7 @@
                 <w:rFonts w:ascii="Calibri" w:hAnsi="Calibri"/>
                 <w:sz w:val="17"/>
               </w:rPr>
-              <w:t>Riesgo moderado (3/6); banderas operativas no constitutivas de fraude.</w:t>
+              <w:t>Alerta forense (4/6); alto riesgo de maquillaje contable (&gt; 70%).</w:t>
             </w:r>
           </w:p>
         </w:tc>
@@ -27803,10 +27803,10 @@
                 <w:color w:val="2D3748"/>
                 <w:sz w:val="19"/>
               </w:rPr>
-              <w:t>Rating Sintético Damodaran: A (SOLVENCIA BUENA (A / A2)) | Altman Z''-Score: 1.56 [ZONA GRIS]</w:t>
+              <w:t>Rating Sintético Damodaran: AAA (GRADO INSTITUCIONAL MÁXIMO (AAA / Aaa)) | Altman Z''-Score: 1.56 [ZONA GRIS]</w:t>
               <w:br/>
               <w:br/>
-              <w:t>SOLVENCIA EQUILIBRADA BAJO MONITOREO: Apalancamiento controlado (1.87x), cobertura de 4.8x y Altman Z''-Score de 1.56. Estructura de capital adecuada sin riesgos inminentes de impago.</w:t>
+              <w:t>SOLVENCIA EQUILIBRADA BAJO MONITOREO: Apalancamiento controlado (1.31x), cobertura de 13.7x y Altman Z''-Score de 1.56. Estructura de capital adecuada sin riesgos inminentes de impago.</w:t>
             </w:r>
           </w:p>
         </w:tc>
@@ -28004,7 +28004,7 @@
                 <w:b/>
                 <w:sz w:val="17"/>
               </w:rPr>
-              <w:t>$3,649.0M</w:t>
+              <w:t>$5,730.0M</w:t>
             </w:r>
           </w:p>
         </w:tc>
@@ -28061,7 +28061,7 @@
                 <w:b/>
                 <w:sz w:val="17"/>
               </w:rPr>
-              <w:t>$+6,977.0M</w:t>
+              <w:t>$4,896.0M</w:t>
             </w:r>
           </w:p>
         </w:tc>
@@ -28120,7 +28120,7 @@
                 <w:b/>
                 <w:sz w:val="17"/>
               </w:rPr>
-              <w:t>1.87x</w:t>
+              <w:t>1.31x</w:t>
             </w:r>
           </w:p>
         </w:tc>
@@ -28134,7 +28134,7 @@
               <w:rPr>
                 <w:sz w:val="17"/>
               </w:rPr>
-              <w:t>APALANCAMIENTO MODERADO (1.5x - 3.0x)</w:t>
+              <w:t>GRADO INVERSIÓN SUPERIOR (&lt; 1.5x)</w:t>
             </w:r>
           </w:p>
         </w:tc>
@@ -28177,7 +28177,7 @@
                 <w:b/>
                 <w:sz w:val="17"/>
               </w:rPr>
-              <w:t>0.56x</w:t>
+              <w:t>0.39x</w:t>
             </w:r>
           </w:p>
         </w:tc>
@@ -28388,7 +28388,7 @@
                 <w:b/>
                 <w:sz w:val="17"/>
               </w:rPr>
-              <w:t>$611.0M</w:t>
+              <w:t>$212.0M</w:t>
             </w:r>
           </w:p>
         </w:tc>
@@ -28445,7 +28445,7 @@
                 <w:b/>
                 <w:sz w:val="17"/>
               </w:rPr>
-              <w:t>4.8x</w:t>
+              <w:t>13.7x</w:t>
             </w:r>
           </w:p>
         </w:tc>
@@ -28458,7 +28458,7 @@
               <w:rPr>
                 <w:sz w:val="17"/>
               </w:rPr>
-              <w:t>VULNERABILIDAD A CICLOS (2.5x - 5.0x)</w:t>
+              <w:t>COBERTURA EXCELENTE (&gt; 10.0x)</w:t>
             </w:r>
           </w:p>
         </w:tc>
@@ -28504,7 +28504,7 @@
                 <w:b/>
                 <w:sz w:val="17"/>
               </w:rPr>
-              <w:t>4.39%</w:t>
+              <w:t>1.52%</w:t>
             </w:r>
           </w:p>
         </w:tc>
@@ -28702,7 +28702,7 @@
                 <w:b/>
                 <w:sz w:val="17"/>
               </w:rPr>
-              <w:t>A</w:t>
+              <w:t>AAA</w:t>
             </w:r>
           </w:p>
         </w:tc>
@@ -28716,7 +28716,7 @@
               <w:rPr>
                 <w:sz w:val="17"/>
               </w:rPr>
-              <w:t>SOLVENCIA BUENA (A / A2)</w:t>
+              <w:t>GRADO INSTITUCIONAL MÁXIMO (AAA / Aaa)</w:t>
             </w:r>
           </w:p>
         </w:tc>
@@ -28730,7 +28730,7 @@
               <w:rPr>
                 <w:sz w:val="17"/>
               </w:rPr>
-              <w:t>Spread Teórico: +1.30%</w:t>
+              <w:t>Spread Teórico: +0.60%</w:t>
             </w:r>
           </w:p>
         </w:tc>
@@ -28760,7 +28760,7 @@
                 <w:b/>
                 <w:sz w:val="17"/>
               </w:rPr>
-              <w:t>0.7%</w:t>
+              <w:t>&lt; 0.2%</w:t>
             </w:r>
           </w:p>
         </w:tc>
@@ -28828,11 +28828,11 @@
           <w:color w:val="2D3748"/>
           <w:sz w:val="19"/>
         </w:rPr>
-        <w:t>• Precio de Referencia: $1826.58  |  WACC Auditado: 10.4% (Rf: 4.96%, ERP: 4.75%)</w:t>
+        <w:t>• Precio de Referencia: $1885.52  |  WACC Auditado: 11.08% (Rf: 5.22%, ERP: 4.75%)</w:t>
         <w:br/>
-        <w:t>• Crecimiento Implícito Calculado: 21.4% Anual a 10 Años (vs. 8.5% Histórico y 10.0% Guidance)</w:t>
+        <w:t>• Crecimiento Implícito Calculado: -3.2% Anual a 10 Años (vs. 48.7% Histórico)</w:t>
         <w:br/>
-        <w:t>• Veredicto: Descuenta expectativas de 21.4% anual (+11.4 pp sobre guidance). Exigencia moderada (+14% a +16%); absorbible por el crecimiento orgánico de e-commerce y fintech (+30% YoY).</w:t>
+        <w:t>• Veredicto: Descuenta expectativas de -3.2% anual. Valoración conservadora (+-3.2% anual); amplio margen de seguridad operativo.</w:t>
       </w:r>
     </w:p>
     <w:p>
@@ -28880,11 +28880,11 @@
         <w:tblLook w:firstColumn="1" w:firstRow="1" w:lastColumn="0" w:lastRow="0" w:noHBand="0" w:noVBand="1" w:val="04A0"/>
         <w:tblBorders>
           <w:top w:val="single" w:sz="6" w:space="0" w:color="D2D6DC"/>
-          <w:left w:val="none"/>
-          <w:bottom w:val="single" w:sz="10" w:space="0" w:color="1B365D"/>
-          <w:right w:val="none"/>
+          <w:bottom w:val="single" w:sz="6" w:space="0" w:color="D2D6DC"/>
           <w:insideH w:val="single" w:sz="4" w:space="0" w:color="D2D6DC"/>
           <w:insideV w:val="none"/>
+          <w:left w:val="none"/>
+          <w:right w:val="none"/>
         </w:tblBorders>
       </w:tblPr>
       <w:tblGrid>
@@ -28984,7 +28984,7 @@
                 <w:b/>
                 <w:sz w:val="17"/>
               </w:rPr>
-              <w:t>$1826.58</w:t>
+              <w:t>$1885.52</w:t>
             </w:r>
           </w:p>
         </w:tc>
@@ -29042,7 +29042,7 @@
                 <w:b/>
                 <w:sz w:val="17"/>
               </w:rPr>
-              <w:t>4.96%</w:t>
+              <w:t>5.22%</w:t>
             </w:r>
           </w:p>
         </w:tc>
@@ -29158,7 +29158,7 @@
                 <w:b/>
                 <w:sz w:val="17"/>
               </w:rPr>
-              <w:t>1.31</w:t>
+              <w:t>1.36</w:t>
             </w:r>
           </w:p>
         </w:tc>
@@ -29216,7 +29216,7 @@
                 <w:b/>
                 <w:sz w:val="17"/>
               </w:rPr>
-              <w:t>5.75%</w:t>
+              <w:t>5.82%</w:t>
             </w:r>
           </w:p>
         </w:tc>
@@ -29274,7 +29274,7 @@
                 <w:b/>
                 <w:sz w:val="17"/>
               </w:rPr>
-              <w:t>3.74%</w:t>
+              <w:t>5.53%</w:t>
             </w:r>
           </w:p>
         </w:tc>
@@ -29332,7 +29332,7 @@
                 <w:b/>
                 <w:sz w:val="17"/>
               </w:rPr>
-              <w:t>35.0%</w:t>
+              <w:t>5.0%</w:t>
             </w:r>
           </w:p>
         </w:tc>
@@ -29390,7 +29390,7 @@
                 <w:b/>
                 <w:sz w:val="17"/>
               </w:rPr>
-              <w:t>10.3%</w:t>
+              <w:t>10.0%</w:t>
             </w:r>
           </w:p>
         </w:tc>
@@ -29448,7 +29448,7 @@
                 <w:b/>
                 <w:sz w:val="17"/>
               </w:rPr>
-              <w:t>89.7%</w:t>
+              <w:t>90.0%</w:t>
             </w:r>
           </w:p>
         </w:tc>
@@ -29506,7 +29506,7 @@
                 <w:b/>
                 <w:sz w:val="17"/>
               </w:rPr>
-              <w:t>10.4%</w:t>
+              <w:t>11.08%</w:t>
             </w:r>
           </w:p>
         </w:tc>
@@ -29564,7 +29564,7 @@
                 <w:b/>
                 <w:sz w:val="17"/>
               </w:rPr>
-              <w:t>8.0%</w:t>
+              <w:t>35.3%</w:t>
             </w:r>
           </w:p>
         </w:tc>
@@ -29734,11 +29734,11 @@
         <w:tblLook w:firstColumn="1" w:firstRow="1" w:lastColumn="0" w:lastRow="0" w:noHBand="0" w:noVBand="1" w:val="04A0"/>
         <w:tblBorders>
           <w:top w:val="single" w:sz="6" w:space="0" w:color="D2D6DC"/>
-          <w:left w:val="none"/>
-          <w:bottom w:val="single" w:sz="10" w:space="0" w:color="1B365D"/>
-          <w:right w:val="none"/>
+          <w:bottom w:val="single" w:sz="6" w:space="0" w:color="D2D6DC"/>
           <w:insideH w:val="single" w:sz="4" w:space="0" w:color="D2D6DC"/>
           <w:insideV w:val="none"/>
+          <w:left w:val="none"/>
+          <w:right w:val="none"/>
         </w:tblBorders>
       </w:tblPr>
       <w:tblGrid>
@@ -29891,7 +29891,7 @@
               <w:rPr>
                 <w:sz w:val="16"/>
               </w:rPr>
-              <w:t>9.40% (Bajo / Expansión)</w:t>
+              <w:t>10.08% (Bajo / Expansión)</w:t>
             </w:r>
           </w:p>
         </w:tc>
@@ -29904,7 +29904,7 @@
               <w:rPr>
                 <w:sz w:val="16"/>
               </w:rPr>
-              <w:t>20.9%</w:t>
+              <w:t>-3.7%</w:t>
             </w:r>
           </w:p>
         </w:tc>
@@ -29917,7 +29917,7 @@
               <w:rPr>
                 <w:sz w:val="16"/>
               </w:rPr>
-              <w:t>20.3%</w:t>
+              <w:t>-4.0%</w:t>
             </w:r>
           </w:p>
         </w:tc>
@@ -29930,7 +29930,7 @@
               <w:rPr>
                 <w:sz w:val="16"/>
               </w:rPr>
-              <w:t>19.7%</w:t>
+              <w:t>-4.3%</w:t>
             </w:r>
           </w:p>
         </w:tc>
@@ -29944,7 +29944,7 @@
                 <w:b/>
                 <w:sz w:val="16"/>
               </w:rPr>
-              <w:t>19.0%</w:t>
+              <w:t>-4.7%</w:t>
             </w:r>
           </w:p>
         </w:tc>
@@ -29957,7 +29957,7 @@
               <w:rPr>
                 <w:sz w:val="16"/>
               </w:rPr>
-              <w:t>18.3%</w:t>
+              <w:t>-5.2%</w:t>
             </w:r>
           </w:p>
         </w:tc>
@@ -29970,7 +29970,7 @@
               <w:rPr>
                 <w:sz w:val="16"/>
               </w:rPr>
-              <w:t>17.5%</w:t>
+              <w:t>-5.6%</w:t>
             </w:r>
           </w:p>
         </w:tc>
@@ -29999,7 +29999,7 @@
               <w:rPr>
                 <w:sz w:val="16"/>
               </w:rPr>
-              <w:t>9.90% (Favorable)</w:t>
+              <w:t>10.58% (Favorable)</w:t>
             </w:r>
           </w:p>
         </w:tc>
@@ -30013,7 +30013,7 @@
               <w:rPr>
                 <w:sz w:val="16"/>
               </w:rPr>
-              <w:t>22.0%</w:t>
+              <w:t>-2.9%</w:t>
             </w:r>
           </w:p>
         </w:tc>
@@ -30027,7 +30027,7 @@
               <w:rPr>
                 <w:sz w:val="16"/>
               </w:rPr>
-              <w:t>21.5%</w:t>
+              <w:t>-3.2%</w:t>
             </w:r>
           </w:p>
         </w:tc>
@@ -30041,7 +30041,7 @@
               <w:rPr>
                 <w:sz w:val="16"/>
               </w:rPr>
-              <w:t>20.9%</w:t>
+              <w:t>-3.6%</w:t>
             </w:r>
           </w:p>
         </w:tc>
@@ -30056,7 +30056,7 @@
                 <w:b/>
                 <w:sz w:val="16"/>
               </w:rPr>
-              <w:t>20.2%</w:t>
+              <w:t>-3.9%</w:t>
             </w:r>
           </w:p>
         </w:tc>
@@ -30070,7 +30070,7 @@
               <w:rPr>
                 <w:sz w:val="16"/>
               </w:rPr>
-              <w:t>19.5%</w:t>
+              <w:t>-4.3%</w:t>
             </w:r>
           </w:p>
         </w:tc>
@@ -30084,7 +30084,7 @@
               <w:rPr>
                 <w:sz w:val="16"/>
               </w:rPr>
-              <w:t>18.8%</w:t>
+              <w:t>-4.8%</w:t>
             </w:r>
           </w:p>
         </w:tc>
@@ -30114,7 +30114,7 @@
               <w:rPr>
                 <w:sz w:val="16"/>
               </w:rPr>
-              <w:t>10.40% (WACC Auditado Base)</w:t>
+              <w:t>11.08% (WACC Auditado Base)</w:t>
             </w:r>
           </w:p>
         </w:tc>
@@ -30129,7 +30129,7 @@
                 <w:b/>
                 <w:sz w:val="16"/>
               </w:rPr>
-              <w:t>23.1%</w:t>
+              <w:t>-2.2%</w:t>
             </w:r>
           </w:p>
         </w:tc>
@@ -30144,7 +30144,7 @@
                 <w:b/>
                 <w:sz w:val="16"/>
               </w:rPr>
-              <w:t>22.5%</w:t>
+              <w:t>-2.5%</w:t>
             </w:r>
           </w:p>
         </w:tc>
@@ -30159,7 +30159,7 @@
                 <w:b/>
                 <w:sz w:val="16"/>
               </w:rPr>
-              <w:t>22.0%</w:t>
+              <w:t>-2.8%</w:t>
             </w:r>
           </w:p>
         </w:tc>
@@ -30174,7 +30174,7 @@
                 <w:b/>
                 <w:sz w:val="16"/>
               </w:rPr>
-              <w:t>21.4%</w:t>
+              <w:t>-3.2%</w:t>
             </w:r>
           </w:p>
         </w:tc>
@@ -30189,7 +30189,7 @@
                 <w:b/>
                 <w:sz w:val="16"/>
               </w:rPr>
-              <w:t>20.7%</w:t>
+              <w:t>-3.5%</w:t>
             </w:r>
           </w:p>
         </w:tc>
@@ -30204,7 +30204,7 @@
                 <w:b/>
                 <w:sz w:val="16"/>
               </w:rPr>
-              <w:t>20.0%</w:t>
+              <w:t>-3.9%</w:t>
             </w:r>
           </w:p>
         </w:tc>
@@ -30234,7 +30234,7 @@
               <w:rPr>
                 <w:sz w:val="16"/>
               </w:rPr>
-              <w:t>10.90% (Exigente)</w:t>
+              <w:t>11.58% (Exigente)</w:t>
             </w:r>
           </w:p>
         </w:tc>
@@ -30248,7 +30248,7 @@
               <w:rPr>
                 <w:sz w:val="16"/>
               </w:rPr>
-              <w:t>24.1%</w:t>
+              <w:t>-1.5%</w:t>
             </w:r>
           </w:p>
         </w:tc>
@@ -30262,7 +30262,7 @@
               <w:rPr>
                 <w:sz w:val="16"/>
               </w:rPr>
-              <w:t>23.6%</w:t>
+              <w:t>-1.8%</w:t>
             </w:r>
           </w:p>
         </w:tc>
@@ -30276,7 +30276,7 @@
               <w:rPr>
                 <w:sz w:val="16"/>
               </w:rPr>
-              <w:t>23.0%</w:t>
+              <w:t>-2.1%</w:t>
             </w:r>
           </w:p>
         </w:tc>
@@ -30291,7 +30291,7 @@
                 <w:b/>
                 <w:sz w:val="16"/>
               </w:rPr>
-              <w:t>22.5%</w:t>
+              <w:t>-2.4%</w:t>
             </w:r>
           </w:p>
         </w:tc>
@@ -30305,7 +30305,7 @@
               <w:rPr>
                 <w:sz w:val="16"/>
               </w:rPr>
-              <w:t>21.9%</w:t>
+              <w:t>-2.8%</w:t>
             </w:r>
           </w:p>
         </w:tc>
@@ -30319,7 +30319,7 @@
               <w:rPr>
                 <w:sz w:val="16"/>
               </w:rPr>
-              <w:t>21.2%</w:t>
+              <w:t>-3.1%</w:t>
             </w:r>
           </w:p>
         </w:tc>
@@ -30348,7 +30348,7 @@
               <w:rPr>
                 <w:sz w:val="16"/>
               </w:rPr>
-              <w:t>11.40% (Estrés / Tipos Altos)</w:t>
+              <w:t>12.08% (Estrés / Tipos Altos)</w:t>
             </w:r>
           </w:p>
         </w:tc>
@@ -30361,7 +30361,7 @@
               <w:rPr>
                 <w:sz w:val="16"/>
               </w:rPr>
-              <w:t>25.1%</w:t>
+              <w:t>-0.8%</w:t>
             </w:r>
           </w:p>
         </w:tc>
@@ -30374,7 +30374,7 @@
               <w:rPr>
                 <w:sz w:val="16"/>
               </w:rPr>
-              <w:t>24.6%</w:t>
+              <w:t>-1.1%</w:t>
             </w:r>
           </w:p>
         </w:tc>
@@ -30387,7 +30387,7 @@
               <w:rPr>
                 <w:sz w:val="16"/>
               </w:rPr>
-              <w:t>24.1%</w:t>
+              <w:t>-1.4%</w:t>
             </w:r>
           </w:p>
         </w:tc>
@@ -30401,7 +30401,7 @@
                 <w:b/>
                 <w:sz w:val="16"/>
               </w:rPr>
-              <w:t>23.5%</w:t>
+              <w:t>-1.7%</w:t>
             </w:r>
           </w:p>
         </w:tc>
@@ -30414,7 +30414,7 @@
               <w:rPr>
                 <w:sz w:val="16"/>
               </w:rPr>
-              <w:t>23.0%</w:t>
+              <w:t>-2.0%</w:t>
             </w:r>
           </w:p>
         </w:tc>
@@ -30427,7 +30427,7 @@
               <w:rPr>
                 <w:sz w:val="16"/>
               </w:rPr>
-              <w:t>22.4%</w:t>
+              <w:t>-2.4%</w:t>
             </w:r>
           </w:p>
         </w:tc>
@@ -30468,11 +30468,11 @@
         <w:tblLook w:firstColumn="1" w:firstRow="1" w:lastColumn="0" w:lastRow="0" w:noHBand="0" w:noVBand="1" w:val="04A0"/>
         <w:tblBorders>
           <w:top w:val="single" w:sz="6" w:space="0" w:color="D2D6DC"/>
-          <w:left w:val="none"/>
-          <w:bottom w:val="single" w:sz="10" w:space="0" w:color="1B365D"/>
-          <w:right w:val="none"/>
+          <w:bottom w:val="single" w:sz="6" w:space="0" w:color="D2D6DC"/>
           <w:insideH w:val="single" w:sz="4" w:space="0" w:color="D2D6DC"/>
           <w:insideV w:val="none"/>
+          <w:left w:val="none"/>
+          <w:right w:val="none"/>
         </w:tblBorders>
       </w:tblPr>
       <w:tblGrid>
@@ -30598,7 +30598,7 @@
               <w:rPr>
                 <w:sz w:val="17"/>
               </w:rPr>
-              <w:t>Poder de fijación de precios y resiliencia de márgenes (11.9% EBIT).</w:t>
+              <w:t>Poder de fijación de precios y resiliencia de márgenes (8.3% EBIT).</w:t>
             </w:r>
           </w:p>
         </w:tc>
@@ -30629,7 +30629,7 @@
               <w:rPr>
                 <w:sz w:val="17"/>
               </w:rPr>
-              <w:t>Ratio Sloan: -25.62% / Montier: 3/6</w:t>
+              <w:t>Ratio Sloan: -25.62% / Montier: 4/6</w:t>
             </w:r>
           </w:p>
         </w:tc>
@@ -30644,7 +30644,7 @@
                 <w:b/>
                 <w:sz w:val="17"/>
               </w:rPr>
-              <w:t>CALIDAD SÓLIDA / BAJO RIESGO</w:t>
+              <w:t>ALERTA FORENSE</w:t>
             </w:r>
           </w:p>
         </w:tc>
@@ -30687,7 +30687,7 @@
               <w:rPr>
                 <w:sz w:val="17"/>
               </w:rPr>
-              <w:t>Cobertura EBIT: 4.8x / Altman Z'': 1.56</w:t>
+              <w:t>Cobertura EBIT: 13.7x / Altman Z'': 1.56</w:t>
             </w:r>
           </w:p>
         </w:tc>
@@ -30701,7 +30701,7 @@
                 <w:b/>
                 <w:sz w:val="17"/>
               </w:rPr>
-              <w:t>SINTÉTICO A</w:t>
+              <w:t>SINTÉTICO AAA</w:t>
             </w:r>
           </w:p>
         </w:tc>
@@ -30714,7 +30714,7 @@
               <w:rPr>
                 <w:sz w:val="17"/>
               </w:rPr>
-              <w:t>Cero estrés financiero; colchón de $3.6B.</w:t>
+              <w:t>Cero estrés financiero; colchón de $5.7B.</w:t>
             </w:r>
           </w:p>
         </w:tc>
@@ -30745,7 +30745,7 @@
               <w:rPr>
                 <w:sz w:val="17"/>
               </w:rPr>
-              <w:t>ROC Greenblatt: 87.6% / ROIC Adj: 12.5%</w:t>
+              <w:t>ROC Greenblatt: 82.4% / ROIC Adj: 27.8%</w:t>
             </w:r>
           </w:p>
         </w:tc>
@@ -30760,7 +30760,7 @@
                 <w:b/>
                 <w:sz w:val="17"/>
               </w:rPr>
-              <w:t>CREADOR DE VALOR</w:t>
+              <w:t>COMPOUNDING MACHINE</w:t>
             </w:r>
           </w:p>
         </w:tc>
@@ -30774,7 +30774,7 @@
               <w:rPr>
                 <w:sz w:val="17"/>
               </w:rPr>
-              <w:t>Spread económico de +2.1 pp sobre WACC (Creación de valor de élite).</w:t>
+              <w:t>Spread económico de +16.7 pp sobre WACC (Creación de valor de élite).</w:t>
             </w:r>
           </w:p>
         </w:tc>
@@ -30803,7 +30803,7 @@
               <w:rPr>
                 <w:sz w:val="17"/>
               </w:rPr>
-              <w:t>Crecimiento Implícito: 21.4% - 6.9%</w:t>
+              <w:t>Crecimiento Implícito: -3.2% - 1.9%</w:t>
             </w:r>
           </w:p>
         </w:tc>
@@ -30817,7 +30817,7 @@
                 <w:b/>
                 <w:sz w:val="17"/>
               </w:rPr>
-              <w:t>PRICED FOR PERFECTION</w:t>
+              <w:t>VALORACIÓN ATRACTIVA</w:t>
             </w:r>
           </w:p>
         </w:tc>
@@ -30830,7 +30830,7 @@
               <w:rPr>
                 <w:sz w:val="17"/>
               </w:rPr>
-              <w:t>Exigencia moderada (+14% a +16%); absorbible por el crecimiento orgánico de e-commerce y fintech (+30% YoY).</w:t>
+              <w:t>Valoración conservadora (+-3.2% anual); amplio margen de seguridad operativo.</w:t>
             </w:r>
           </w:p>
         </w:tc>

</xml_diff>

<commit_message>
feat(scoring): complete multi-archetype methodological hardening for banking, reits and tech (FASE 2)
</commit_message>
<xml_diff>
--- a/data/processed/MELI/Analisis_Resultados_Q2_2026_MELI.docx
+++ b/data/processed/MELI/Analisis_Resultados_Q2_2026_MELI.docx
@@ -11170,7 +11170,7 @@
           <w:color w:val="2D3748"/>
           <w:sz w:val="20"/>
         </w:rPr>
-        <w:t>Optimiza tanto su margen comercial (MB 42.7% vs 44.5% (-1.83%)) como la productividad de sus activos instalados (Rot 0.82x vs 1.15x (-0.32x)).</w:t>
+        <w:t>Optimiza tanto su margen comercial (MB 42.7% vs 44.5% (-1.83%)) como la productividad de sus activos instalados (Rot 0.75x vs 0.85x (-0.10x)).</w:t>
       </w:r>
     </w:p>
     <w:tbl>
@@ -11353,7 +11353,7 @@
                 <w:color w:val="2D3748"/>
                 <w:sz w:val="18"/>
               </w:rPr>
-              <w:t>Utilidad neta positiva sobre la base de activos instalados.</w:t>
+              <w:t>Utilidad neta positiva sobre la base de activos promedio instalados.</w:t>
             </w:r>
           </w:p>
         </w:tc>
@@ -11379,7 +11379,7 @@
                 <w:color w:val="2D3748"/>
                 <w:sz w:val="18"/>
               </w:rPr>
-              <w:t>4.37% &gt; 0%</w:t>
+              <w:t>3.96% &gt; 0%</w:t>
             </w:r>
           </w:p>
         </w:tc>
@@ -11591,7 +11591,7 @@
                 <w:color w:val="2D3748"/>
                 <w:sz w:val="18"/>
               </w:rPr>
-              <w:t>4.4% vs 7.9% (-3.56%)</w:t>
+              <w:t>4.0% vs 5.9% (-1.92%)</w:t>
             </w:r>
           </w:p>
         </w:tc>
@@ -12227,7 +12227,7 @@
                 <w:color w:val="2D3748"/>
                 <w:sz w:val="18"/>
               </w:rPr>
-              <w:t>Rot 0.82x vs 1.15x (-0.32x)</w:t>
+              <w:t>Rot 0.75x vs 0.85x (-0.10x)</w:t>
             </w:r>
           </w:p>
         </w:tc>
@@ -19721,7 +19721,7 @@
                 <w:color w:val="1B365D"/>
                 <w:sz w:val="21"/>
               </w:rPr>
-              <w:t>📌 DICTAMEN DE VALOR ECONÓMICO: 🏰 WIDE MOAT / COMPOUNDING MACHINE (SPREAD +16.69 p.p.)</w:t>
+              <w:t>📌 DICTAMEN DE VALOR ECONÓMICO: 🛡️ NARROW MOAT / CREACIÓN DE VALOR SOSTENIBLE (SPREAD +7.07 p.p.)</w:t>
               <w:br/>
             </w:r>
           </w:p>
@@ -19748,7 +19748,7 @@
                 <w:color w:val="2D3748"/>
                 <w:sz w:val="19"/>
               </w:rPr>
-              <w:t>• ROIC Ajustado por Intangibles (LTM): 27.77% frente a un ROIC contable tradicional de 25.45%.</w:t>
+              <w:t>• ROIC Ajustado por Intangibles (LTM): 18.10% frente a un ROIC contable tradicional de 25.45%.</w:t>
             </w:r>
           </w:p>
           <w:p>
@@ -19761,7 +19761,7 @@
                 <w:color w:val="2D3748"/>
                 <w:sz w:val="19"/>
               </w:rPr>
-              <w:t>• Costo Promedio Ponderado de Capital (WACC): 11.08% (Costo del Equity Ke: 11.70%, Deuda Neta Kd: 5.53%).</w:t>
+              <w:t>• Costo Promedio Ponderado de Capital (WACC): 11.03% (Costo del Equity Ke: 11.67%, Deuda Neta Kd: 5.50%).</w:t>
             </w:r>
           </w:p>
           <w:p>
@@ -19774,7 +19774,7 @@
                 <w:color w:val="2D3748"/>
                 <w:sz w:val="19"/>
               </w:rPr>
-              <w:t>• Spread Económico Neto: +16.69 p.p. de rendimiento por encima del costo de capital exigido por el mercado.</w:t>
+              <w:t>• Spread Económico Neto: +7.07 p.p. de rendimiento por encima del costo de capital exigido por el mercado.</w:t>
             </w:r>
           </w:p>
           <w:p>
@@ -19787,7 +19787,7 @@
                 <w:color w:val="2D3748"/>
                 <w:sz w:val="19"/>
               </w:rPr>
-              <w:t>• Stock de Intangibles Fuera de Balance: $7,451.2M capitalizados en innovación y amortizados económicamente a 3 años.</w:t>
+              <w:t>• Stock de Intangibles Fuera de Balance: $7,912.4M capitalizados en innovación y amortizados económicamente a 3 años.</w:t>
             </w:r>
           </w:p>
           <w:p>
@@ -19800,7 +19800,7 @@
                 <w:color w:val="2D3748"/>
                 <w:sz w:val="19"/>
               </w:rPr>
-              <w:t>• Tesis de Foso Defensivo: El negocio genera un retorno ajustado (27.77%) que supera a su costo de capital (11.08%) por más de 16.69 puntos porcentuales. Por cada $100 de capital empleado, crea más de $15 anuales de valor neto por encima de lo que exigen accionistas y bancos. Posee ventajas competitivas profundas y duraderas.</w:t>
+              <w:t>• Tesis de Foso Defensivo: El negocio genera un Spread positivo de +7.07 p.p. sobre el WACC (11.03%), demostrando capacidad de generar valor económico superior a la media de forma constante frente a sus competidores.</w:t>
             </w:r>
           </w:p>
         </w:tc>
@@ -19966,7 +19966,7 @@
               <w:rPr>
                 <w:sz w:val="17"/>
               </w:rPr>
-              <w:t>$1885.52</w:t>
+              <w:t>$1821.81</w:t>
             </w:r>
           </w:p>
         </w:tc>
@@ -20047,7 +20047,7 @@
               <w:rPr>
                 <w:sz w:val="17"/>
               </w:rPr>
-              <w:t>$95,590.6M</w:t>
+              <w:t>$92,360.8M</w:t>
             </w:r>
           </w:p>
         </w:tc>
@@ -20128,7 +20128,7 @@
               <w:rPr>
                 <w:sz w:val="17"/>
               </w:rPr>
-              <w:t>5.22%</w:t>
+              <w:t>5.19%</w:t>
             </w:r>
           </w:p>
         </w:tc>
@@ -21435,7 +21435,7 @@
         <w:rPr>
           <w:sz w:val="19"/>
         </w:rPr>
-        <w:t>El ROIC Tradicional contable (25.45%) sobrestima el retorno al mandar el I+D a gasto inmediato. La metodología Damodaran capitaliza la innovación a 3 años, reconociendo $7,451.2M de intangibles fuera de balance. El ROIC Ajustado resultante de 27.77% refleja el verdadero retorno económico sobre el capital total invertido ($18,300.7M).</w:t>
+        <w:t>El ROIC Tradicional contable (25.45%) sobrestima el retorno al mandar el I+D a gasto inmediato. La metodología Damodaran capitaliza la innovación a 3 años, reconociendo $7,912.4M de intangibles fuera de balance. El ROIC Ajustado resultante de 18.10% refleja el verdadero retorno económico sobre el capital total invertido ($18,531.3M).</w:t>
       </w:r>
     </w:p>
     <w:tbl>
@@ -21752,7 +21752,7 @@
                 <w:b/>
                 <w:sz w:val="17"/>
               </w:rPr>
-              <w:t>+25.74 p.p.</w:t>
+              <w:t>+25.79 p.p.</w:t>
             </w:r>
           </w:p>
         </w:tc>
@@ -21898,7 +21898,7 @@
                 <w:b/>
                 <w:sz w:val="17"/>
               </w:rPr>
-              <w:t>+34.09 p.p.</w:t>
+              <w:t>+34.15 p.p.</w:t>
             </w:r>
           </w:p>
         </w:tc>
@@ -22037,7 +22037,7 @@
                 <w:b/>
                 <w:sz w:val="17"/>
               </w:rPr>
-              <w:t>+39.09 p.p.</w:t>
+              <w:t>+39.14 p.p.</w:t>
             </w:r>
           </w:p>
         </w:tc>
@@ -22183,7 +22183,7 @@
                 <w:b/>
                 <w:sz w:val="17"/>
               </w:rPr>
-              <w:t>+25.78 p.p.</w:t>
+              <w:t>+25.83 p.p.</w:t>
             </w:r>
           </w:p>
         </w:tc>
@@ -22322,7 +22322,7 @@
                 <w:b/>
                 <w:sz w:val="17"/>
               </w:rPr>
-              <w:t>+19.12 p.p.</w:t>
+              <w:t>+19.17 p.p.</w:t>
             </w:r>
           </w:p>
         </w:tc>
@@ -22411,7 +22411,7 @@
                 <w:b/>
                 <w:sz w:val="17"/>
               </w:rPr>
-              <w:t>27.77%</w:t>
+              <w:t>18.10%</w:t>
             </w:r>
           </w:p>
         </w:tc>
@@ -22432,7 +22432,7 @@
               <w:rPr>
                 <w:sz w:val="17"/>
               </w:rPr>
-              <w:t>$7,451.2M</w:t>
+              <w:t>$7,912.4M</w:t>
             </w:r>
           </w:p>
         </w:tc>
@@ -22453,7 +22453,7 @@
               <w:rPr>
                 <w:sz w:val="17"/>
               </w:rPr>
-              <w:t>$18,300.7M</w:t>
+              <w:t>$18,531.3M</w:t>
             </w:r>
           </w:p>
         </w:tc>
@@ -22475,7 +22475,7 @@
                 <w:b/>
                 <w:sz w:val="17"/>
               </w:rPr>
-              <w:t>+16.69 p.p.</w:t>
+              <w:t>+7.07 p.p.</w:t>
             </w:r>
           </w:p>
         </w:tc>
@@ -22490,7 +22490,7 @@
           <w:i/>
           <w:sz w:val="18"/>
         </w:rPr>
-        <w:t>Matriz de Sensibilidad de Vida Útil: N-1 (2a) = 27.84% | N Base (3a) = 27.77% | N+1 (4a) = 27.98%.</w:t>
+        <w:t>Matriz de Sensibilidad de Vida Útil: N-1 (2a) = 18.18% | N Base (3a) = 18.10% | N+1 (4a) = 17.94%.</w:t>
       </w:r>
     </w:p>
     <w:p>
@@ -22506,9 +22506,9 @@
         <w:rPr>
           <w:sz w:val="19"/>
         </w:rPr>
-        <w:t>Spread Económico = ROIC Ajustado (27.77%) − WACC (11.08%) = +16.69 p.p.</w:t>
+        <w:t>Spread Económico = ROIC Ajustado (18.10%) − WACC (11.03%) = +7.07 p.p.</w:t>
         <w:br/>
-        <w:t>Dictamen: 🏰 WIDE MOAT / COMPOUNDING MACHINE. La compañía supera holgadamente su costo de capital, generando retornos netos excedentes sobre cada dólar invertido.</w:t>
+        <w:t>Dictamen: 🛡️ NARROW MOAT / CREACIÓN DE VALOR SOSTENIBLE. La compañía supera holgadamente su costo de capital, generando retornos netos excedentes sobre cada dólar invertido.</w:t>
       </w:r>
     </w:p>
     <w:p>
@@ -22709,7 +22709,7 @@
                 <w:b/>
                 <w:sz w:val="17"/>
               </w:rPr>
-              <w:t>5.22%</w:t>
+              <w:t>5.19%</w:t>
             </w:r>
           </w:p>
         </w:tc>
@@ -23014,7 +23014,7 @@
                 <w:b/>
                 <w:sz w:val="17"/>
               </w:rPr>
-              <w:t>11.70%</w:t>
+              <w:t>11.67%</w:t>
             </w:r>
           </w:p>
         </w:tc>
@@ -23115,7 +23115,7 @@
                 <w:b/>
                 <w:sz w:val="17"/>
               </w:rPr>
-              <w:t>5.53%</w:t>
+              <w:t>5.50%</w:t>
             </w:r>
           </w:p>
         </w:tc>
@@ -23217,7 +23217,7 @@
                 <w:b/>
                 <w:sz w:val="17"/>
               </w:rPr>
-              <w:t>11.08%</w:t>
+              <w:t>11.03%</w:t>
             </w:r>
           </w:p>
         </w:tc>
@@ -23628,7 +23628,7 @@
                 <w:b/>
                 <w:sz w:val="17"/>
               </w:rPr>
-              <w:t>$7,451.2M</w:t>
+              <w:t>$7,912.4M</w:t>
             </w:r>
           </w:p>
         </w:tc>
@@ -23729,7 +23729,7 @@
                 <w:b/>
                 <w:sz w:val="17"/>
               </w:rPr>
-              <w:t>$18,300.7M</w:t>
+              <w:t>$18,531.3M</w:t>
             </w:r>
           </w:p>
         </w:tc>
@@ -23835,7 +23835,7 @@
                 <w:b/>
                 <w:sz w:val="17"/>
               </w:rPr>
-              <w:t>27.77%</w:t>
+              <w:t>18.10%</w:t>
             </w:r>
           </w:p>
         </w:tc>
@@ -23944,7 +23944,7 @@
                 <w:b/>
                 <w:sz w:val="17"/>
               </w:rPr>
-              <w:t>+16.69 p.p.</w:t>
+              <w:t>+7.07 p.p.</w:t>
             </w:r>
           </w:p>
         </w:tc>
@@ -24050,7 +24050,7 @@
                 <w:b/>
                 <w:sz w:val="17"/>
               </w:rPr>
-              <w:t>🏰 WIDE MOAT / COMPOUNDING MACHINE</w:t>
+              <w:t>🛡️ NARROW MOAT / CREACIÓN DE VALOR SOSTENIBLE</w:t>
             </w:r>
           </w:p>
         </w:tc>
@@ -24124,7 +24124,7 @@
           <w:color w:val="1B365D"/>
           <w:sz w:val="21"/>
         </w:rPr>
-        <w:t>DICTAMEN FORENSE INSTITUCIONAL (LTM): ALERTA FORENSE</w:t>
+        <w:t>DICTAMEN FORENSE INSTITUCIONAL (LTM): ZONA DE VIGILANCIA</w:t>
         <w:br/>
       </w:r>
       <w:r>
@@ -24135,9 +24135,9 @@
         </w:rPr>
         <w:t>• Ratio Sloan de Devengos: -25.62% [ALTA CONVERSIÓN DE CAJA (CFO &gt; NI)]</w:t>
         <w:br/>
-        <w:t>• Montier C-Score: 4 / 6 [RIESGO ALTO / ALERTA FORENSE (&gt; 70% ALERTA FORENSE)]</w:t>
+        <w:t>• Montier C-Score: 3 / 6 [RIESGO MEDIO-ALTO / VIGILANCIA RIGUROSA (&lt; 40% VIGILANCIA)]</w:t>
         <w:br/>
-        <w:t>• Dictamen: ALERTA FORENSE POR CALIDAD DE RESULTADOS: Detección de devengos desproporcionados (Ratio Sloan: -25.62%) o Montier C-Score elevado (4/6). Se recomienda auditoría minuciosa de políticas contables, partidas no monetarias y devengos acumulados.</w:t>
+        <w:t>• Dictamen: ZONA DE VIGILANCIA POR DESFASES OPERATIVOS: Montier C-Score de 3/6 con divergencias puntuales en capital de trabajo. Revisar ciclos estacionales de inventarios y condiciones comerciales de cobro.</w:t>
       </w:r>
     </w:p>
     <w:p>
@@ -25974,7 +25974,7 @@
           <w:color w:val="1B365D"/>
           <w:sz w:val="23"/>
         </w:rPr>
-        <w:t>12.3. Desglose Forense Montier C-Score (4 / 6)</w:t>
+        <w:t>12.3. Desglose Forense Montier C-Score (3 / 6)</w:t>
       </w:r>
     </w:p>
     <w:p>
@@ -26781,7 +26781,7 @@
                 <w:rFonts w:ascii="Calibri" w:hAnsi="Calibri"/>
                 <w:sz w:val="16"/>
               </w:rPr>
-              <w:t>Crecimiento Interanual de Activos Totales &gt; 10.0%</w:t>
+              <w:t>Δ Activos &gt; 15.0% y Δ Activos &gt; 1.15 * Δ Ventas</w:t>
             </w:r>
           </w:p>
         </w:tc>
@@ -26804,7 +26804,7 @@
                 <w:rFonts w:ascii="Calibri" w:hAnsi="Calibri"/>
                 <w:sz w:val="16"/>
               </w:rPr>
-              <w:t>ΔActivos: +20.4% (Umbral: &gt; 10%)</w:t>
+              <w:t>ΔActivos: +20.4% vs ΔVentas: +21.8%</w:t>
             </w:r>
           </w:p>
         </w:tc>
@@ -26826,10 +26826,10 @@
               <w:rPr>
                 <w:rFonts w:ascii="Calibri" w:hAnsi="Calibri"/>
                 <w:b/>
-                <w:color w:val="C00000"/>
+                <w:color w:val="276A3C"/>
                 <w:sz w:val="16"/>
               </w:rPr>
-              <w:t>🚩 FLAG</w:t>
+              <w:t>✅ OK</w:t>
             </w:r>
           </w:p>
         </w:tc>
@@ -26852,7 +26852,7 @@
                 <w:rFonts w:ascii="Calibri" w:hAnsi="Calibri"/>
                 <w:sz w:val="16"/>
               </w:rPr>
-              <w:t>Expansión acelerada de balance o adquisiciones seriales (M&amp;A). Montier advierte que suele utilizarse para disimular debilidad orgánica y distorsionar resultados.</w:t>
+              <w:t>Expansión desproporcionada de balance no respaldada por ventas. Montier advierte que suele utilizarse para disimular debilidad orgánica o acumulación de partidas improductivas.</w:t>
             </w:r>
           </w:p>
         </w:tc>
@@ -26869,7 +26869,7 @@
           <w:color w:val="1B365D"/>
           <w:sz w:val="17"/>
         </w:rPr>
-        <w:t>Dictamen Montier: 4 / 6 Banderas — RIESGO ALTO / ALERTA FORENSE. Probabilidad empírica de manipulación &gt; 70%.</w:t>
+        <w:t>Dictamen Montier: 3 / 6 Banderas — RIESGO MEDIO-ALTO / VIGILANCIA RIGUROSA. Probabilidad empírica de manipulación zona de vigilancia (&lt; 40%).</w:t>
       </w:r>
     </w:p>
     <w:p>
@@ -27702,7 +27702,7 @@
                 <w:rFonts w:ascii="Calibri" w:hAnsi="Calibri"/>
                 <w:sz w:val="17"/>
               </w:rPr>
-              <w:t>4 / 6</w:t>
+              <w:t>3 / 6</w:t>
             </w:r>
           </w:p>
         </w:tc>
@@ -27748,7 +27748,7 @@
                 <w:rFonts w:ascii="Calibri" w:hAnsi="Calibri"/>
                 <w:sz w:val="17"/>
               </w:rPr>
-              <w:t>Alerta forense (4/6); alto riesgo de maquillaje contable (&gt; 70%).</w:t>
+              <w:t>Vigilancia rigurosa (3/6); desfases en capital de trabajo o balance (&lt; 40%).</w:t>
             </w:r>
           </w:p>
         </w:tc>
@@ -28828,11 +28828,11 @@
           <w:color w:val="2D3748"/>
           <w:sz w:val="19"/>
         </w:rPr>
-        <w:t>• Precio de Referencia: $1885.52  |  WACC Auditado: 11.08% (Rf: 5.22%, ERP: 4.75%)</w:t>
+        <w:t>• Precio de Referencia: $1821.81  |  WACC Auditado: 11.03% (Rf: 5.19%, ERP: 4.75%)</w:t>
         <w:br/>
-        <w:t>• Crecimiento Implícito Calculado: -3.2% Anual a 10 Años (vs. 48.7% Histórico)</w:t>
+        <w:t>• Crecimiento Implícito Calculado: -3.7% Anual a 10 Años (vs. 48.7% Histórico)</w:t>
         <w:br/>
-        <w:t>• Veredicto: Descuenta expectativas de -3.2% anual. Valoración conservadora (+-3.2% anual); amplio margen de seguridad operativo.</w:t>
+        <w:t>• Veredicto: Descuenta expectativas de -3.7% anual. Valoración conservadora (+-3.7% anual); amplio margen de seguridad operativo.</w:t>
       </w:r>
     </w:p>
     <w:p>
@@ -28984,7 +28984,7 @@
                 <w:b/>
                 <w:sz w:val="17"/>
               </w:rPr>
-              <w:t>$1885.52</w:t>
+              <w:t>$1821.81</w:t>
             </w:r>
           </w:p>
         </w:tc>
@@ -29042,7 +29042,7 @@
                 <w:b/>
                 <w:sz w:val="17"/>
               </w:rPr>
-              <w:t>5.22%</w:t>
+              <w:t>5.19%</w:t>
             </w:r>
           </w:p>
         </w:tc>
@@ -29216,7 +29216,7 @@
                 <w:b/>
                 <w:sz w:val="17"/>
               </w:rPr>
-              <w:t>5.82%</w:t>
+              <w:t>5.79%</w:t>
             </w:r>
           </w:p>
         </w:tc>
@@ -29274,7 +29274,7 @@
                 <w:b/>
                 <w:sz w:val="17"/>
               </w:rPr>
-              <w:t>5.53%</w:t>
+              <w:t>5.5%</w:t>
             </w:r>
           </w:p>
         </w:tc>
@@ -29390,7 +29390,7 @@
                 <w:b/>
                 <w:sz w:val="17"/>
               </w:rPr>
-              <w:t>10.0%</w:t>
+              <w:t>10.3%</w:t>
             </w:r>
           </w:p>
         </w:tc>
@@ -29448,7 +29448,7 @@
                 <w:b/>
                 <w:sz w:val="17"/>
               </w:rPr>
-              <w:t>90.0%</w:t>
+              <w:t>89.7%</w:t>
             </w:r>
           </w:p>
         </w:tc>
@@ -29506,7 +29506,7 @@
                 <w:b/>
                 <w:sz w:val="17"/>
               </w:rPr>
-              <w:t>11.08%</w:t>
+              <w:t>11.03%</w:t>
             </w:r>
           </w:p>
         </w:tc>
@@ -29891,7 +29891,7 @@
               <w:rPr>
                 <w:sz w:val="16"/>
               </w:rPr>
-              <w:t>10.08% (Bajo / Expansión)</w:t>
+              <w:t>10.03% (Bajo / Expansión)</w:t>
             </w:r>
           </w:p>
         </w:tc>
@@ -29904,7 +29904,7 @@
               <w:rPr>
                 <w:sz w:val="16"/>
               </w:rPr>
-              <w:t>-3.7%</w:t>
+              <w:t>-4.2%</w:t>
             </w:r>
           </w:p>
         </w:tc>
@@ -29917,7 +29917,7 @@
               <w:rPr>
                 <w:sz w:val="16"/>
               </w:rPr>
-              <w:t>-4.0%</w:t>
+              <w:t>-4.5%</w:t>
             </w:r>
           </w:p>
         </w:tc>
@@ -29930,7 +29930,7 @@
               <w:rPr>
                 <w:sz w:val="16"/>
               </w:rPr>
-              <w:t>-4.3%</w:t>
+              <w:t>-4.9%</w:t>
             </w:r>
           </w:p>
         </w:tc>
@@ -29944,7 +29944,7 @@
                 <w:b/>
                 <w:sz w:val="16"/>
               </w:rPr>
-              <w:t>-4.7%</w:t>
+              <w:t>-5.3%</w:t>
             </w:r>
           </w:p>
         </w:tc>
@@ -29957,7 +29957,7 @@
               <w:rPr>
                 <w:sz w:val="16"/>
               </w:rPr>
-              <w:t>-5.2%</w:t>
+              <w:t>-5.7%</w:t>
             </w:r>
           </w:p>
         </w:tc>
@@ -29970,7 +29970,7 @@
               <w:rPr>
                 <w:sz w:val="16"/>
               </w:rPr>
-              <w:t>-5.6%</w:t>
+              <w:t>-6.2%</w:t>
             </w:r>
           </w:p>
         </w:tc>
@@ -29999,7 +29999,7 @@
               <w:rPr>
                 <w:sz w:val="16"/>
               </w:rPr>
-              <w:t>10.58% (Favorable)</w:t>
+              <w:t>10.53% (Favorable)</w:t>
             </w:r>
           </w:p>
         </w:tc>
@@ -30013,7 +30013,7 @@
               <w:rPr>
                 <w:sz w:val="16"/>
               </w:rPr>
-              <w:t>-2.9%</w:t>
+              <w:t>-3.5%</w:t>
             </w:r>
           </w:p>
         </w:tc>
@@ -30027,7 +30027,7 @@
               <w:rPr>
                 <w:sz w:val="16"/>
               </w:rPr>
-              <w:t>-3.2%</w:t>
+              <w:t>-3.8%</w:t>
             </w:r>
           </w:p>
         </w:tc>
@@ -30041,7 +30041,7 @@
               <w:rPr>
                 <w:sz w:val="16"/>
               </w:rPr>
-              <w:t>-3.6%</w:t>
+              <w:t>-4.1%</w:t>
             </w:r>
           </w:p>
         </w:tc>
@@ -30056,7 +30056,7 @@
                 <w:b/>
                 <w:sz w:val="16"/>
               </w:rPr>
-              <w:t>-3.9%</w:t>
+              <w:t>-4.5%</w:t>
             </w:r>
           </w:p>
         </w:tc>
@@ -30070,7 +30070,7 @@
               <w:rPr>
                 <w:sz w:val="16"/>
               </w:rPr>
-              <w:t>-4.3%</w:t>
+              <w:t>-4.9%</w:t>
             </w:r>
           </w:p>
         </w:tc>
@@ -30084,7 +30084,7 @@
               <w:rPr>
                 <w:sz w:val="16"/>
               </w:rPr>
-              <w:t>-4.8%</w:t>
+              <w:t>-5.3%</w:t>
             </w:r>
           </w:p>
         </w:tc>
@@ -30114,7 +30114,7 @@
               <w:rPr>
                 <w:sz w:val="16"/>
               </w:rPr>
-              <w:t>11.08% (WACC Auditado Base)</w:t>
+              <w:t>11.03% (WACC Auditado Base)</w:t>
             </w:r>
           </w:p>
         </w:tc>
@@ -30129,7 +30129,7 @@
                 <w:b/>
                 <w:sz w:val="16"/>
               </w:rPr>
-              <w:t>-2.2%</w:t>
+              <w:t>-2.8%</w:t>
             </w:r>
           </w:p>
         </w:tc>
@@ -30144,7 +30144,7 @@
                 <w:b/>
                 <w:sz w:val="16"/>
               </w:rPr>
-              <w:t>-2.5%</w:t>
+              <w:t>-3.1%</w:t>
             </w:r>
           </w:p>
         </w:tc>
@@ -30159,7 +30159,7 @@
                 <w:b/>
                 <w:sz w:val="16"/>
               </w:rPr>
-              <w:t>-2.8%</w:t>
+              <w:t>-3.4%</w:t>
             </w:r>
           </w:p>
         </w:tc>
@@ -30174,7 +30174,7 @@
                 <w:b/>
                 <w:sz w:val="16"/>
               </w:rPr>
-              <w:t>-3.2%</w:t>
+              <w:t>-3.7%</w:t>
             </w:r>
           </w:p>
         </w:tc>
@@ -30189,7 +30189,7 @@
                 <w:b/>
                 <w:sz w:val="16"/>
               </w:rPr>
-              <w:t>-3.5%</w:t>
+              <w:t>-4.1%</w:t>
             </w:r>
           </w:p>
         </w:tc>
@@ -30204,7 +30204,7 @@
                 <w:b/>
                 <w:sz w:val="16"/>
               </w:rPr>
-              <w:t>-3.9%</w:t>
+              <w:t>-4.5%</w:t>
             </w:r>
           </w:p>
         </w:tc>
@@ -30234,7 +30234,7 @@
               <w:rPr>
                 <w:sz w:val="16"/>
               </w:rPr>
-              <w:t>11.58% (Exigente)</w:t>
+              <w:t>11.53% (Exigente)</w:t>
             </w:r>
           </w:p>
         </w:tc>
@@ -30248,7 +30248,7 @@
               <w:rPr>
                 <w:sz w:val="16"/>
               </w:rPr>
-              <w:t>-1.5%</w:t>
+              <w:t>-2.1%</w:t>
             </w:r>
           </w:p>
         </w:tc>
@@ -30262,7 +30262,7 @@
               <w:rPr>
                 <w:sz w:val="16"/>
               </w:rPr>
-              <w:t>-1.8%</w:t>
+              <w:t>-2.4%</w:t>
             </w:r>
           </w:p>
         </w:tc>
@@ -30276,7 +30276,7 @@
               <w:rPr>
                 <w:sz w:val="16"/>
               </w:rPr>
-              <w:t>-2.1%</w:t>
+              <w:t>-2.7%</w:t>
             </w:r>
           </w:p>
         </w:tc>
@@ -30291,7 +30291,7 @@
                 <w:b/>
                 <w:sz w:val="16"/>
               </w:rPr>
-              <w:t>-2.4%</w:t>
+              <w:t>-3.0%</w:t>
             </w:r>
           </w:p>
         </w:tc>
@@ -30305,7 +30305,7 @@
               <w:rPr>
                 <w:sz w:val="16"/>
               </w:rPr>
-              <w:t>-2.8%</w:t>
+              <w:t>-3.3%</w:t>
             </w:r>
           </w:p>
         </w:tc>
@@ -30319,7 +30319,7 @@
               <w:rPr>
                 <w:sz w:val="16"/>
               </w:rPr>
-              <w:t>-3.1%</w:t>
+              <w:t>-3.7%</w:t>
             </w:r>
           </w:p>
         </w:tc>
@@ -30348,7 +30348,7 @@
               <w:rPr>
                 <w:sz w:val="16"/>
               </w:rPr>
-              <w:t>12.08% (Estrés / Tipos Altos)</w:t>
+              <w:t>12.03% (Estrés / Tipos Altos)</w:t>
             </w:r>
           </w:p>
         </w:tc>
@@ -30361,7 +30361,7 @@
               <w:rPr>
                 <w:sz w:val="16"/>
               </w:rPr>
-              <w:t>-0.8%</w:t>
+              <w:t>-1.4%</w:t>
             </w:r>
           </w:p>
         </w:tc>
@@ -30374,7 +30374,7 @@
               <w:rPr>
                 <w:sz w:val="16"/>
               </w:rPr>
-              <w:t>-1.1%</w:t>
+              <w:t>-1.7%</w:t>
             </w:r>
           </w:p>
         </w:tc>
@@ -30387,7 +30387,7 @@
               <w:rPr>
                 <w:sz w:val="16"/>
               </w:rPr>
-              <w:t>-1.4%</w:t>
+              <w:t>-2.0%</w:t>
             </w:r>
           </w:p>
         </w:tc>
@@ -30401,7 +30401,7 @@
                 <w:b/>
                 <w:sz w:val="16"/>
               </w:rPr>
-              <w:t>-1.7%</w:t>
+              <w:t>-2.3%</w:t>
             </w:r>
           </w:p>
         </w:tc>
@@ -30414,7 +30414,7 @@
               <w:rPr>
                 <w:sz w:val="16"/>
               </w:rPr>
-              <w:t>-2.0%</w:t>
+              <w:t>-2.6%</w:t>
             </w:r>
           </w:p>
         </w:tc>
@@ -30427,7 +30427,7 @@
               <w:rPr>
                 <w:sz w:val="16"/>
               </w:rPr>
-              <w:t>-2.4%</w:t>
+              <w:t>-2.9%</w:t>
             </w:r>
           </w:p>
         </w:tc>
@@ -30629,7 +30629,7 @@
               <w:rPr>
                 <w:sz w:val="17"/>
               </w:rPr>
-              <w:t>Ratio Sloan: -25.62% / Montier: 4/6</w:t>
+              <w:t>Ratio Sloan: -25.62% / Montier: 3/6</w:t>
             </w:r>
           </w:p>
         </w:tc>
@@ -30644,7 +30644,7 @@
                 <w:b/>
                 <w:sz w:val="17"/>
               </w:rPr>
-              <w:t>ALERTA FORENSE</w:t>
+              <w:t>CALIDAD SÓLIDA / BAJO RIESGO</w:t>
             </w:r>
           </w:p>
         </w:tc>
@@ -30745,7 +30745,7 @@
               <w:rPr>
                 <w:sz w:val="17"/>
               </w:rPr>
-              <w:t>ROC Greenblatt: 82.4% / ROIC Adj: 27.8%</w:t>
+              <w:t>ROC Greenblatt: 82.4% / ROIC Adj: 18.1%</w:t>
             </w:r>
           </w:p>
         </w:tc>
@@ -30760,7 +30760,7 @@
                 <w:b/>
                 <w:sz w:val="17"/>
               </w:rPr>
-              <w:t>COMPOUNDING MACHINE</w:t>
+              <w:t>CREADOR DE VALOR</w:t>
             </w:r>
           </w:p>
         </w:tc>
@@ -30774,7 +30774,7 @@
               <w:rPr>
                 <w:sz w:val="17"/>
               </w:rPr>
-              <w:t>Spread económico de +16.7 pp sobre WACC (Creación de valor de élite).</w:t>
+              <w:t>Spread económico de +7.1 pp sobre WACC (Creación de valor de élite).</w:t>
             </w:r>
           </w:p>
         </w:tc>
@@ -30803,7 +30803,7 @@
               <w:rPr>
                 <w:sz w:val="17"/>
               </w:rPr>
-              <w:t>Crecimiento Implícito: -3.2% - 1.9%</w:t>
+              <w:t>Crecimiento Implícito: -3.7% - 1.4%</w:t>
             </w:r>
           </w:p>
         </w:tc>
@@ -30830,7 +30830,7 @@
               <w:rPr>
                 <w:sz w:val="17"/>
               </w:rPr>
-              <w:t>Valoración conservadora (+-3.2% anual); amplio margen de seguridad operativo.</w:t>
+              <w:t>Valoración conservadora (+-3.7% anual); amplio margen de seguridad operativo.</w:t>
             </w:r>
           </w:p>
         </w:tc>

</xml_diff>

<commit_message>
feat(valuation): implement two-stage excess return, sotp for platforms and blume beta calibration (FASE 3)
</commit_message>
<xml_diff>
--- a/data/processed/MELI/Analisis_Resultados_Q2_2026_MELI.docx
+++ b/data/processed/MELI/Analisis_Resultados_Q2_2026_MELI.docx
@@ -28830,9 +28830,9 @@
         </w:rPr>
         <w:t>• Precio de Referencia: $1821.81  |  WACC Auditado: 11.03% (Rf: 5.19%, ERP: 4.75%)</w:t>
         <w:br/>
-        <w:t>• Crecimiento Implícito Calculado: -3.7% Anual a 10 Años (vs. 48.7% Histórico)</w:t>
+        <w:t>• Crecimiento Implícito Calculado: 14.0% Anual a 10 Años (vs. 48.7% Histórico)</w:t>
         <w:br/>
-        <w:t>• Veredicto: Descuenta expectativas de -3.7% anual. Valoración conservadora (+-3.7% anual); amplio margen de seguridad operativo.</w:t>
+        <w:t>• Veredicto: Descuenta expectativas de 14.0% anual. Exigencia asumible (+14.0% anual); alineada con el ritmo tendencial de la empresa y su sector.</w:t>
       </w:r>
     </w:p>
     <w:p>
@@ -29564,7 +29564,7 @@
                 <w:b/>
                 <w:sz w:val="17"/>
               </w:rPr>
-              <w:t>35.3%</w:t>
+              <w:t>10.2%</w:t>
             </w:r>
           </w:p>
         </w:tc>
@@ -29904,7 +29904,7 @@
               <w:rPr>
                 <w:sz w:val="16"/>
               </w:rPr>
-              <w:t>-4.2%</w:t>
+              <w:t>13.5%</w:t>
             </w:r>
           </w:p>
         </w:tc>
@@ -29917,7 +29917,7 @@
               <w:rPr>
                 <w:sz w:val="16"/>
               </w:rPr>
-              <w:t>-4.5%</w:t>
+              <w:t>13.0%</w:t>
             </w:r>
           </w:p>
         </w:tc>
@@ -29930,7 +29930,7 @@
               <w:rPr>
                 <w:sz w:val="16"/>
               </w:rPr>
-              <w:t>-4.9%</w:t>
+              <w:t>12.5%</w:t>
             </w:r>
           </w:p>
         </w:tc>
@@ -29944,7 +29944,7 @@
                 <w:b/>
                 <w:sz w:val="16"/>
               </w:rPr>
-              <w:t>-5.3%</w:t>
+              <w:t>12.0%</w:t>
             </w:r>
           </w:p>
         </w:tc>
@@ -29957,7 +29957,7 @@
               <w:rPr>
                 <w:sz w:val="16"/>
               </w:rPr>
-              <w:t>-5.7%</w:t>
+              <w:t>11.4%</w:t>
             </w:r>
           </w:p>
         </w:tc>
@@ -29970,7 +29970,7 @@
               <w:rPr>
                 <w:sz w:val="16"/>
               </w:rPr>
-              <w:t>-6.2%</w:t>
+              <w:t>10.7%</w:t>
             </w:r>
           </w:p>
         </w:tc>
@@ -30013,7 +30013,7 @@
               <w:rPr>
                 <w:sz w:val="16"/>
               </w:rPr>
-              <w:t>-3.5%</w:t>
+              <w:t>14.5%</w:t>
             </w:r>
           </w:p>
         </w:tc>
@@ -30027,7 +30027,7 @@
               <w:rPr>
                 <w:sz w:val="16"/>
               </w:rPr>
-              <w:t>-3.8%</w:t>
+              <w:t>14.0%</w:t>
             </w:r>
           </w:p>
         </w:tc>
@@ -30041,7 +30041,7 @@
               <w:rPr>
                 <w:sz w:val="16"/>
               </w:rPr>
-              <w:t>-4.1%</w:t>
+              <w:t>13.5%</w:t>
             </w:r>
           </w:p>
         </w:tc>
@@ -30056,7 +30056,7 @@
                 <w:b/>
                 <w:sz w:val="16"/>
               </w:rPr>
-              <w:t>-4.5%</w:t>
+              <w:t>13.0%</w:t>
             </w:r>
           </w:p>
         </w:tc>
@@ -30070,7 +30070,7 @@
               <w:rPr>
                 <w:sz w:val="16"/>
               </w:rPr>
-              <w:t>-4.9%</w:t>
+              <w:t>12.4%</w:t>
             </w:r>
           </w:p>
         </w:tc>
@@ -30084,7 +30084,7 @@
               <w:rPr>
                 <w:sz w:val="16"/>
               </w:rPr>
-              <w:t>-5.3%</w:t>
+              <w:t>11.8%</w:t>
             </w:r>
           </w:p>
         </w:tc>
@@ -30129,7 +30129,7 @@
                 <w:b/>
                 <w:sz w:val="16"/>
               </w:rPr>
-              <w:t>-2.8%</w:t>
+              <w:t>15.4%</w:t>
             </w:r>
           </w:p>
         </w:tc>
@@ -30144,7 +30144,7 @@
                 <w:b/>
                 <w:sz w:val="16"/>
               </w:rPr>
-              <w:t>-3.1%</w:t>
+              <w:t>15.0%</w:t>
             </w:r>
           </w:p>
         </w:tc>
@@ -30159,7 +30159,7 @@
                 <w:b/>
                 <w:sz w:val="16"/>
               </w:rPr>
-              <w:t>-3.4%</w:t>
+              <w:t>14.5%</w:t>
             </w:r>
           </w:p>
         </w:tc>
@@ -30174,7 +30174,7 @@
                 <w:b/>
                 <w:sz w:val="16"/>
               </w:rPr>
-              <w:t>-3.7%</w:t>
+              <w:t>14.0%</w:t>
             </w:r>
           </w:p>
         </w:tc>
@@ -30189,7 +30189,7 @@
                 <w:b/>
                 <w:sz w:val="16"/>
               </w:rPr>
-              <w:t>-4.1%</w:t>
+              <w:t>13.5%</w:t>
             </w:r>
           </w:p>
         </w:tc>
@@ -30204,7 +30204,7 @@
                 <w:b/>
                 <w:sz w:val="16"/>
               </w:rPr>
-              <w:t>-4.5%</w:t>
+              <w:t>12.9%</w:t>
             </w:r>
           </w:p>
         </w:tc>
@@ -30248,7 +30248,7 @@
               <w:rPr>
                 <w:sz w:val="16"/>
               </w:rPr>
-              <w:t>-2.1%</w:t>
+              <w:t>16.3%</w:t>
             </w:r>
           </w:p>
         </w:tc>
@@ -30262,7 +30262,7 @@
               <w:rPr>
                 <w:sz w:val="16"/>
               </w:rPr>
-              <w:t>-2.4%</w:t>
+              <w:t>15.9%</w:t>
             </w:r>
           </w:p>
         </w:tc>
@@ -30276,7 +30276,7 @@
               <w:rPr>
                 <w:sz w:val="16"/>
               </w:rPr>
-              <w:t>-2.7%</w:t>
+              <w:t>15.4%</w:t>
             </w:r>
           </w:p>
         </w:tc>
@@ -30291,7 +30291,7 @@
                 <w:b/>
                 <w:sz w:val="16"/>
               </w:rPr>
-              <w:t>-3.0%</w:t>
+              <w:t>15.0%</w:t>
             </w:r>
           </w:p>
         </w:tc>
@@ -30305,7 +30305,7 @@
               <w:rPr>
                 <w:sz w:val="16"/>
               </w:rPr>
-              <w:t>-3.3%</w:t>
+              <w:t>14.5%</w:t>
             </w:r>
           </w:p>
         </w:tc>
@@ -30319,7 +30319,7 @@
               <w:rPr>
                 <w:sz w:val="16"/>
               </w:rPr>
-              <w:t>-3.7%</w:t>
+              <w:t>13.9%</w:t>
             </w:r>
           </w:p>
         </w:tc>
@@ -30361,7 +30361,7 @@
               <w:rPr>
                 <w:sz w:val="16"/>
               </w:rPr>
-              <w:t>-1.4%</w:t>
+              <w:t>17.2%</w:t>
             </w:r>
           </w:p>
         </w:tc>
@@ -30374,7 +30374,7 @@
               <w:rPr>
                 <w:sz w:val="16"/>
               </w:rPr>
-              <w:t>-1.7%</w:t>
+              <w:t>16.8%</w:t>
             </w:r>
           </w:p>
         </w:tc>
@@ -30387,7 +30387,7 @@
               <w:rPr>
                 <w:sz w:val="16"/>
               </w:rPr>
-              <w:t>-2.0%</w:t>
+              <w:t>16.4%</w:t>
             </w:r>
           </w:p>
         </w:tc>
@@ -30401,7 +30401,7 @@
                 <w:b/>
                 <w:sz w:val="16"/>
               </w:rPr>
-              <w:t>-2.3%</w:t>
+              <w:t>15.9%</w:t>
             </w:r>
           </w:p>
         </w:tc>
@@ -30414,7 +30414,7 @@
               <w:rPr>
                 <w:sz w:val="16"/>
               </w:rPr>
-              <w:t>-2.6%</w:t>
+              <w:t>15.4%</w:t>
             </w:r>
           </w:p>
         </w:tc>
@@ -30427,7 +30427,7 @@
               <w:rPr>
                 <w:sz w:val="16"/>
               </w:rPr>
-              <w:t>-2.9%</w:t>
+              <w:t>14.9%</w:t>
             </w:r>
           </w:p>
         </w:tc>
@@ -30458,7 +30458,497 @@
           <w:color w:val="1B365D"/>
           <w:sz w:val="23"/>
         </w:rPr>
-        <w:t>14.4. Cuadro de Mando Consolidado y Tesis Final de Inversión</w:t>
+        <w:t>14.4. Valoración por Suma de las Partes (SOTP - Platform Ecosystem)</w:t>
+      </w:r>
+    </w:p>
+    <w:p>
+      <w:r>
+        <w:rPr>
+          <w:rFonts w:ascii="Calibri" w:hAnsi="Calibri"/>
+          <w:color w:val="2D3748"/>
+          <w:sz w:val="18"/>
+        </w:rPr>
+        <w:t>Al combinar infraestructura de e-commerce y fintech bancaria/crédito, se desagregan los componentes: Comercio a 3.2x EV/Ventas ($61,920.3 M) y FinTech a 2.4x EV/Ventas ($37,996.6 M), resultando en un Equity Value de $95,020.9 M y un Valor Teórico SOTP de $1874.28 por título.</w:t>
+      </w:r>
+    </w:p>
+    <w:tbl>
+      <w:tblPr>
+        <w:tblW w:type="auto" w:w="0"/>
+        <w:jc w:val="center"/>
+        <w:tblLook w:firstColumn="1" w:firstRow="1" w:lastColumn="0" w:lastRow="0" w:noHBand="0" w:noVBand="1" w:val="04A0"/>
+        <w:tblBorders>
+          <w:top w:val="single" w:sz="6" w:space="0" w:color="D2D6DC"/>
+          <w:bottom w:val="single" w:sz="6" w:space="0" w:color="D2D6DC"/>
+          <w:insideH w:val="single" w:sz="4" w:space="0" w:color="D2D6DC"/>
+          <w:insideV w:val="none"/>
+          <w:left w:val="none"/>
+          <w:right w:val="none"/>
+        </w:tblBorders>
+      </w:tblPr>
+      <w:tblGrid>
+        <w:gridCol w:w="1958"/>
+        <w:gridCol w:w="1958"/>
+        <w:gridCol w:w="1958"/>
+        <w:gridCol w:w="1958"/>
+        <w:gridCol w:w="1958"/>
+      </w:tblGrid>
+      <w:tr>
+        <w:tc>
+          <w:tcPr>
+            <w:tcW w:type="dxa" w:w="1958"/>
+            <w:shd w:fill="1B365D"/>
+          </w:tcPr>
+          <w:p>
+            <w:r>
+              <w:rPr>
+                <w:b/>
+                <w:color w:val="FFFFFF"/>
+                <w:sz w:val="18"/>
+              </w:rPr>
+              <w:t>Segmento Operativo</w:t>
+            </w:r>
+          </w:p>
+        </w:tc>
+        <w:tc>
+          <w:tcPr>
+            <w:tcW w:type="dxa" w:w="1958"/>
+            <w:shd w:fill="1B365D"/>
+          </w:tcPr>
+          <w:p>
+            <w:r>
+              <w:rPr>
+                <w:b/>
+                <w:color w:val="FFFFFF"/>
+                <w:sz w:val="18"/>
+              </w:rPr>
+              <w:t>Ventas LTM</w:t>
+            </w:r>
+          </w:p>
+        </w:tc>
+        <w:tc>
+          <w:tcPr>
+            <w:tcW w:type="dxa" w:w="1958"/>
+            <w:shd w:fill="1B365D"/>
+          </w:tcPr>
+          <w:p>
+            <w:r>
+              <w:rPr>
+                <w:b/>
+                <w:color w:val="FFFFFF"/>
+                <w:sz w:val="18"/>
+              </w:rPr>
+              <w:t>Múltiplo EV/Sales</w:t>
+            </w:r>
+          </w:p>
+        </w:tc>
+        <w:tc>
+          <w:tcPr>
+            <w:tcW w:type="dxa" w:w="1958"/>
+            <w:shd w:fill="1B365D"/>
+          </w:tcPr>
+          <w:p>
+            <w:r>
+              <w:rPr>
+                <w:b/>
+                <w:color w:val="FFFFFF"/>
+                <w:sz w:val="18"/>
+              </w:rPr>
+              <w:t>Enterprise Value</w:t>
+            </w:r>
+          </w:p>
+        </w:tc>
+        <w:tc>
+          <w:tcPr>
+            <w:tcW w:type="dxa" w:w="1958"/>
+            <w:shd w:fill="1B365D"/>
+          </w:tcPr>
+          <w:p>
+            <w:r>
+              <w:rPr>
+                <w:b/>
+                <w:color w:val="FFFFFF"/>
+                <w:sz w:val="18"/>
+              </w:rPr>
+              <w:t>Ponderación EV</w:t>
+            </w:r>
+          </w:p>
+        </w:tc>
+      </w:tr>
+      <w:tr>
+        <w:tc>
+          <w:tcPr>
+            <w:tcW w:type="dxa" w:w="1958"/>
+          </w:tcPr>
+          <w:p>
+            <w:r>
+              <w:rPr>
+                <w:b/>
+                <w:sz w:val="17"/>
+              </w:rPr>
+              <w:t>Comercio Electrónico / Marketplace</w:t>
+            </w:r>
+          </w:p>
+        </w:tc>
+        <w:tc>
+          <w:tcPr>
+            <w:tcW w:type="dxa" w:w="1958"/>
+          </w:tcPr>
+          <w:p>
+            <w:r>
+              <w:rPr>
+                <w:sz w:val="17"/>
+              </w:rPr>
+              <w:t>$19,350.1 M</w:t>
+            </w:r>
+          </w:p>
+        </w:tc>
+        <w:tc>
+          <w:tcPr>
+            <w:tcW w:type="dxa" w:w="1958"/>
+          </w:tcPr>
+          <w:p>
+            <w:r>
+              <w:rPr>
+                <w:sz w:val="17"/>
+              </w:rPr>
+              <w:t>3.2x</w:t>
+            </w:r>
+          </w:p>
+        </w:tc>
+        <w:tc>
+          <w:tcPr>
+            <w:tcW w:type="dxa" w:w="1958"/>
+          </w:tcPr>
+          <w:p>
+            <w:r>
+              <w:rPr>
+                <w:b/>
+                <w:sz w:val="17"/>
+              </w:rPr>
+              <w:t>$61,920.3 M</w:t>
+            </w:r>
+          </w:p>
+        </w:tc>
+        <w:tc>
+          <w:tcPr>
+            <w:tcW w:type="dxa" w:w="1958"/>
+          </w:tcPr>
+          <w:p>
+            <w:r>
+              <w:rPr>
+                <w:sz w:val="17"/>
+              </w:rPr>
+              <w:t>62.0%</w:t>
+            </w:r>
+          </w:p>
+        </w:tc>
+      </w:tr>
+      <w:tr>
+        <w:tc>
+          <w:tcPr>
+            <w:tcW w:type="dxa" w:w="1958"/>
+            <w:shd w:fill="F7FAFC"/>
+          </w:tcPr>
+          <w:p>
+            <w:r>
+              <w:rPr>
+                <w:b/>
+                <w:sz w:val="17"/>
+              </w:rPr>
+              <w:t>FinTech y Crédito Digital</w:t>
+            </w:r>
+          </w:p>
+        </w:tc>
+        <w:tc>
+          <w:tcPr>
+            <w:tcW w:type="dxa" w:w="1958"/>
+            <w:shd w:fill="F7FAFC"/>
+          </w:tcPr>
+          <w:p>
+            <w:r>
+              <w:rPr>
+                <w:sz w:val="17"/>
+              </w:rPr>
+              <w:t>$15,831.9 M</w:t>
+            </w:r>
+          </w:p>
+        </w:tc>
+        <w:tc>
+          <w:tcPr>
+            <w:tcW w:type="dxa" w:w="1958"/>
+            <w:shd w:fill="F7FAFC"/>
+          </w:tcPr>
+          <w:p>
+            <w:r>
+              <w:rPr>
+                <w:sz w:val="17"/>
+              </w:rPr>
+              <w:t>2.4x</w:t>
+            </w:r>
+          </w:p>
+        </w:tc>
+        <w:tc>
+          <w:tcPr>
+            <w:tcW w:type="dxa" w:w="1958"/>
+            <w:shd w:fill="F7FAFC"/>
+          </w:tcPr>
+          <w:p>
+            <w:r>
+              <w:rPr>
+                <w:b/>
+                <w:sz w:val="17"/>
+              </w:rPr>
+              <w:t>$37,996.6 M</w:t>
+            </w:r>
+          </w:p>
+        </w:tc>
+        <w:tc>
+          <w:tcPr>
+            <w:tcW w:type="dxa" w:w="1958"/>
+            <w:shd w:fill="F7FAFC"/>
+          </w:tcPr>
+          <w:p>
+            <w:r>
+              <w:rPr>
+                <w:sz w:val="17"/>
+              </w:rPr>
+              <w:t>38.0%</w:t>
+            </w:r>
+          </w:p>
+        </w:tc>
+      </w:tr>
+      <w:tr>
+        <w:tc>
+          <w:tcPr>
+            <w:tcW w:type="dxa" w:w="1958"/>
+          </w:tcPr>
+          <w:p>
+            <w:r>
+              <w:rPr>
+                <w:b/>
+                <w:sz w:val="17"/>
+              </w:rPr>
+              <w:t>Total Enterprise Value (EV)</w:t>
+            </w:r>
+          </w:p>
+        </w:tc>
+        <w:tc>
+          <w:tcPr>
+            <w:tcW w:type="dxa" w:w="1958"/>
+          </w:tcPr>
+          <w:p>
+            <w:r>
+              <w:rPr>
+                <w:b/>
+                <w:sz w:val="17"/>
+              </w:rPr>
+              <w:t>$35,182.0 M</w:t>
+            </w:r>
+          </w:p>
+        </w:tc>
+        <w:tc>
+          <w:tcPr>
+            <w:tcW w:type="dxa" w:w="1958"/>
+          </w:tcPr>
+          <w:p>
+            <w:r>
+              <w:rPr>
+                <w:b/>
+                <w:sz w:val="17"/>
+              </w:rPr>
+              <w:t>—</w:t>
+            </w:r>
+          </w:p>
+        </w:tc>
+        <w:tc>
+          <w:tcPr>
+            <w:tcW w:type="dxa" w:w="1958"/>
+          </w:tcPr>
+          <w:p>
+            <w:r>
+              <w:rPr>
+                <w:b/>
+                <w:sz w:val="17"/>
+              </w:rPr>
+              <w:t>$99,916.9 M</w:t>
+            </w:r>
+          </w:p>
+        </w:tc>
+        <w:tc>
+          <w:tcPr>
+            <w:tcW w:type="dxa" w:w="1958"/>
+          </w:tcPr>
+          <w:p>
+            <w:r>
+              <w:rPr>
+                <w:b/>
+                <w:sz w:val="17"/>
+              </w:rPr>
+              <w:t>100.0%</w:t>
+            </w:r>
+          </w:p>
+        </w:tc>
+      </w:tr>
+      <w:tr>
+        <w:tc>
+          <w:tcPr>
+            <w:tcW w:type="dxa" w:w="1958"/>
+            <w:shd w:fill="F7FAFC"/>
+          </w:tcPr>
+          <w:p>
+            <w:r>
+              <w:rPr>
+                <w:b/>
+                <w:sz w:val="17"/>
+              </w:rPr>
+              <w:t>(-) Deuda Neta</w:t>
+            </w:r>
+          </w:p>
+        </w:tc>
+        <w:tc>
+          <w:tcPr>
+            <w:tcW w:type="dxa" w:w="1958"/>
+            <w:shd w:fill="F7FAFC"/>
+          </w:tcPr>
+          <w:p>
+            <w:r>
+              <w:rPr>
+                <w:sz w:val="17"/>
+              </w:rPr>
+              <w:t>—</w:t>
+            </w:r>
+          </w:p>
+        </w:tc>
+        <w:tc>
+          <w:tcPr>
+            <w:tcW w:type="dxa" w:w="1958"/>
+            <w:shd w:fill="F7FAFC"/>
+          </w:tcPr>
+          <w:p>
+            <w:r>
+              <w:rPr>
+                <w:sz w:val="17"/>
+              </w:rPr>
+              <w:t>—</w:t>
+            </w:r>
+          </w:p>
+        </w:tc>
+        <w:tc>
+          <w:tcPr>
+            <w:tcW w:type="dxa" w:w="1958"/>
+            <w:shd w:fill="F7FAFC"/>
+          </w:tcPr>
+          <w:p>
+            <w:r>
+              <w:rPr>
+                <w:b/>
+                <w:sz w:val="17"/>
+              </w:rPr>
+              <w:t>$-4,896.0 M</w:t>
+            </w:r>
+          </w:p>
+        </w:tc>
+        <w:tc>
+          <w:tcPr>
+            <w:tcW w:type="dxa" w:w="1958"/>
+            <w:shd w:fill="F7FAFC"/>
+          </w:tcPr>
+          <w:p>
+            <w:r>
+              <w:rPr>
+                <w:sz w:val="17"/>
+              </w:rPr>
+              <w:t>—</w:t>
+            </w:r>
+          </w:p>
+        </w:tc>
+      </w:tr>
+      <w:tr>
+        <w:tc>
+          <w:tcPr>
+            <w:tcW w:type="dxa" w:w="1958"/>
+          </w:tcPr>
+          <w:p>
+            <w:r>
+              <w:rPr>
+                <w:b/>
+                <w:sz w:val="17"/>
+              </w:rPr>
+              <w:t>Equity Value Justificado SOTP</w:t>
+            </w:r>
+          </w:p>
+        </w:tc>
+        <w:tc>
+          <w:tcPr>
+            <w:tcW w:type="dxa" w:w="1958"/>
+          </w:tcPr>
+          <w:p>
+            <w:r>
+              <w:rPr>
+                <w:b/>
+                <w:sz w:val="17"/>
+              </w:rPr>
+              <w:t>—</w:t>
+            </w:r>
+          </w:p>
+        </w:tc>
+        <w:tc>
+          <w:tcPr>
+            <w:tcW w:type="dxa" w:w="1958"/>
+          </w:tcPr>
+          <w:p>
+            <w:r>
+              <w:rPr>
+                <w:b/>
+                <w:sz w:val="17"/>
+              </w:rPr>
+              <w:t>—</w:t>
+            </w:r>
+          </w:p>
+        </w:tc>
+        <w:tc>
+          <w:tcPr>
+            <w:tcW w:type="dxa" w:w="1958"/>
+          </w:tcPr>
+          <w:p>
+            <w:r>
+              <w:rPr>
+                <w:b/>
+                <w:sz w:val="17"/>
+              </w:rPr>
+              <w:t>$95,020.9 M</w:t>
+            </w:r>
+          </w:p>
+        </w:tc>
+        <w:tc>
+          <w:tcPr>
+            <w:tcW w:type="dxa" w:w="1958"/>
+          </w:tcPr>
+          <w:p>
+            <w:r>
+              <w:rPr>
+                <w:b/>
+                <w:sz w:val="17"/>
+              </w:rPr>
+              <w:t>$1874.28/sh (+2.9%)</w:t>
+            </w:r>
+          </w:p>
+        </w:tc>
+      </w:tr>
+    </w:tbl>
+    <w:p/>
+    <w:p>
+      <w:pPr>
+        <w:pStyle w:val="Heading2"/>
+      </w:pPr>
+      <w:r>
+        <w:rPr>
+          <w:rFonts w:ascii="Calibri" w:hAnsi="Calibri"/>
+          <w:b/>
+          <w:color w:val="1B365D"/>
+          <w:sz w:val="23"/>
+        </w:rPr>
+        <w:t>14.5. Cuadro de Mando Consolidado y Tesis Final de Inversión</w:t>
       </w:r>
     </w:p>
     <w:tbl>
@@ -30658,7 +31148,7 @@
               <w:rPr>
                 <w:sz w:val="17"/>
               </w:rPr>
-              <w:t>Ganancias 100% avaladas por caja real ($2.17 CFO por dólar de NI).</w:t>
+              <w:t>Ganancias avaladas por caja real ($2.17 CFO por dólar de NI).</w:t>
             </w:r>
           </w:p>
         </w:tc>
@@ -30803,7 +31293,7 @@
               <w:rPr>
                 <w:sz w:val="17"/>
               </w:rPr>
-              <w:t>Crecimiento Implícito: -3.7% - 1.4%</w:t>
+              <w:t>Crecimiento Implícito: 14.0% - 1.4%</w:t>
             </w:r>
           </w:p>
         </w:tc>
@@ -30817,7 +31307,7 @@
                 <w:b/>
                 <w:sz w:val="17"/>
               </w:rPr>
-              <w:t>VALORACIÓN ATRACTIVA</w:t>
+              <w:t>VALORACIÓN EXIGENTE</w:t>
             </w:r>
           </w:p>
         </w:tc>
@@ -30830,7 +31320,7 @@
               <w:rPr>
                 <w:sz w:val="17"/>
               </w:rPr>
-              <w:t>Valoración conservadora (+-3.7% anual); amplio margen de seguridad operativo.</w:t>
+              <w:t>Exigencia asumible (+14.0% anual); alineada con el ritmo tendencial de la empresa y su sector.</w:t>
             </w:r>
           </w:p>
         </w:tc>

</xml_diff>

<commit_message>
feat(dashboard,pipeline): dual view standardized vs as-reported with 100% spanish translation and auto-sanitizer
</commit_message>
<xml_diff>
--- a/data/processed/MELI/Analisis_Resultados_Q2_2026_MELI.docx
+++ b/data/processed/MELI/Analisis_Resultados_Q2_2026_MELI.docx
@@ -65,7 +65,7 @@
                 <w:color w:val="D1DFF5"/>
                 <w:sz w:val="17"/>
               </w:rPr>
-              <w:t>Fecha de Análisis: 17 de Septiembre de 2026 | Período Contable: 30 de Junio de 2026</w:t>
+              <w:t>Fecha de Análisis: 20 de Septiembre de 2026 | Período Contable: 30 de Junio de 2026</w:t>
               <w:br/>
               <w:t>Fuente Oficial: Formulario 10-Q, Formularios 8-K, Form 4, Form 144 (SEC EDGAR) &amp; Q2 2026 Earnings Call Transcript</w:t>
             </w:r>
@@ -29904,7 +29904,7 @@
               <w:rPr>
                 <w:sz w:val="16"/>
               </w:rPr>
-              <w:t>13.5%</w:t>
+              <w:t>13.6%</w:t>
             </w:r>
           </w:p>
         </w:tc>
@@ -29917,7 +29917,7 @@
               <w:rPr>
                 <w:sz w:val="16"/>
               </w:rPr>
-              <w:t>13.0%</w:t>
+              <w:t>13.1%</w:t>
             </w:r>
           </w:p>
         </w:tc>
@@ -29930,7 +29930,7 @@
               <w:rPr>
                 <w:sz w:val="16"/>
               </w:rPr>
-              <w:t>12.5%</w:t>
+              <w:t>12.6%</w:t>
             </w:r>
           </w:p>
         </w:tc>
@@ -29970,7 +29970,7 @@
               <w:rPr>
                 <w:sz w:val="16"/>
               </w:rPr>
-              <w:t>10.7%</w:t>
+              <w:t>10.8%</w:t>
             </w:r>
           </w:p>
         </w:tc>
@@ -30027,7 +30027,7 @@
               <w:rPr>
                 <w:sz w:val="16"/>
               </w:rPr>
-              <w:t>14.0%</w:t>
+              <w:t>14.1%</w:t>
             </w:r>
           </w:p>
         </w:tc>
@@ -30041,7 +30041,7 @@
               <w:rPr>
                 <w:sz w:val="16"/>
               </w:rPr>
-              <w:t>13.5%</w:t>
+              <w:t>13.6%</w:t>
             </w:r>
           </w:p>
         </w:tc>
@@ -30070,7 +30070,7 @@
               <w:rPr>
                 <w:sz w:val="16"/>
               </w:rPr>
-              <w:t>12.4%</w:t>
+              <w:t>12.5%</w:t>
             </w:r>
           </w:p>
         </w:tc>
@@ -30084,7 +30084,7 @@
               <w:rPr>
                 <w:sz w:val="16"/>
               </w:rPr>
-              <w:t>11.8%</w:t>
+              <w:t>11.9%</w:t>
             </w:r>
           </w:p>
         </w:tc>
@@ -30204,7 +30204,7 @@
                 <w:b/>
                 <w:sz w:val="16"/>
               </w:rPr>
-              <w:t>12.9%</w:t>
+              <w:t>13.0%</w:t>
             </w:r>
           </w:p>
         </w:tc>
@@ -30276,7 +30276,7 @@
               <w:rPr>
                 <w:sz w:val="16"/>
               </w:rPr>
-              <w:t>15.4%</w:t>
+              <w:t>15.5%</w:t>
             </w:r>
           </w:p>
         </w:tc>
@@ -30319,7 +30319,7 @@
               <w:rPr>
                 <w:sz w:val="16"/>
               </w:rPr>
-              <w:t>13.9%</w:t>
+              <w:t>14.0%</w:t>
             </w:r>
           </w:p>
         </w:tc>
@@ -30401,7 +30401,7 @@
                 <w:b/>
                 <w:sz w:val="16"/>
               </w:rPr>
-              <w:t>15.9%</w:t>
+              <w:t>16.0%</w:t>
             </w:r>
           </w:p>
         </w:tc>
@@ -30414,7 +30414,7 @@
               <w:rPr>
                 <w:sz w:val="16"/>
               </w:rPr>
-              <w:t>15.4%</w:t>
+              <w:t>15.5%</w:t>
             </w:r>
           </w:p>
         </w:tc>
@@ -30427,7 +30427,7 @@
               <w:rPr>
                 <w:sz w:val="16"/>
               </w:rPr>
-              <w:t>14.9%</w:t>
+              <w:t>15.0%</w:t>
             </w:r>
           </w:p>
         </w:tc>
@@ -30468,7 +30468,7 @@
           <w:color w:val="2D3748"/>
           <w:sz w:val="18"/>
         </w:rPr>
-        <w:t>Al combinar infraestructura de e-commerce y fintech bancaria/crédito, se desagregan los componentes: Comercio a 3.2x EV/Ventas ($61,920.3 M) y FinTech a 2.4x EV/Ventas ($37,996.6 M), resultando en un Equity Value de $95,020.9 M y un Valor Teórico SOTP de $1874.28 por título.</w:t>
+        <w:t>Al combinar infraestructura de e-commerce y fintech bancaria/crédito, se desagregan los componentes: Comercio a 3.2x EV/Ventas ($61,920.3 M) y FinTech a 2.4x EV/Ventas ($37,996.6 M), resultando en un Equity Value de $94,733.9 M y un Valor Teórico SOTP de $1868.62 por título.</w:t>
       </w:r>
     </w:p>
     <w:tbl>
@@ -30844,7 +30844,7 @@
                 <w:b/>
                 <w:sz w:val="17"/>
               </w:rPr>
-              <w:t>$-4,896.0 M</w:t>
+              <w:t>$-5,183.0 M</w:t>
             </w:r>
           </w:p>
         </w:tc>
@@ -30916,7 +30916,7 @@
                 <w:b/>
                 <w:sz w:val="17"/>
               </w:rPr>
-              <w:t>$95,020.9 M</w:t>
+              <w:t>$94,733.9 M</w:t>
             </w:r>
           </w:p>
         </w:tc>
@@ -30930,7 +30930,7 @@
                 <w:b/>
                 <w:sz w:val="17"/>
               </w:rPr>
-              <w:t>$1874.28/sh (+2.9%)</w:t>
+              <w:t>$1868.62/sh (+2.6%)</w:t>
             </w:r>
           </w:p>
         </w:tc>
@@ -31293,7 +31293,7 @@
               <w:rPr>
                 <w:sz w:val="17"/>
               </w:rPr>
-              <w:t>Crecimiento Implícito: 14.0% - 1.4%</w:t>
+              <w:t>Crecimiento Implícito: 14.0% - 1.5%</w:t>
             </w:r>
           </w:p>
         </w:tc>

</xml_diff>